<commit_message>
feat(umsetzung Phase 1-3) -added
</commit_message>
<xml_diff>
--- a/2026-04-16_Projektdokumentation.docx
+++ b/2026-04-16_Projektdokumentation.docx
@@ -4,6 +4,15 @@
   <w:body>
     <w:sdt>
       <w:sdtPr>
+        <w:rPr>
+          <w:rFonts w:asciiTheme="minorHAnsi" w:eastAsiaTheme="minorHAnsi" w:hAnsiTheme="minorHAnsi" w:cstheme="minorBidi"/>
+          <w:color w:val="auto"/>
+          <w:kern w:val="2"/>
+          <w:sz w:val="24"/>
+          <w:szCs w:val="24"/>
+          <w:lang w:eastAsia="en-US"/>
+          <w14:ligatures w14:val="standardContextual"/>
+        </w:rPr>
         <w:id w:val="1255945467"/>
         <w:docPartObj>
           <w:docPartGallery w:val="Table of Contents"/>
@@ -12,15 +21,8 @@
       </w:sdtPr>
       <w:sdtEndPr>
         <w:rPr>
-          <w:rFonts w:asciiTheme="minorHAnsi" w:eastAsiaTheme="minorHAnsi" w:hAnsiTheme="minorHAnsi" w:cstheme="minorBidi"/>
-          <w:b/>
-          <w:bCs/>
-          <w:color w:val="auto"/>
-          <w:kern w:val="2"/>
-          <w:sz w:val="24"/>
-          <w:szCs w:val="24"/>
-          <w:lang w:eastAsia="en-US"/>
-          <w14:ligatures w14:val="standardContextual"/>
+          <w:b/>
+          <w:bCs/>
         </w:rPr>
       </w:sdtEndPr>
       <w:sdtContent>
@@ -982,7 +984,7 @@
                 <w:noProof/>
                 <w:webHidden/>
               </w:rPr>
-              <w:t>8</w:t>
+              <w:t>7</w:t>
             </w:r>
             <w:r>
               <w:rPr>
@@ -1050,7 +1052,7 @@
                 <w:noProof/>
                 <w:webHidden/>
               </w:rPr>
-              <w:t>9</w:t>
+              <w:t>8</w:t>
             </w:r>
             <w:r>
               <w:rPr>
@@ -1136,73 +1138,8 @@
           <w:sz w:val="20"/>
           <w:szCs w:val="20"/>
         </w:rPr>
-        <w:t xml:space="preserve">Der Kunde für dieses Projekt ist die Support-Abteilung meines eigenen Betriebes, diese ist für ihre Aufgaben in der Verwaltung, </w:t>
-      </w:r>
-      <w:proofErr w:type="spellStart"/>
-      <w:r>
-        <w:rPr>
-          <w:sz w:val="20"/>
-          <w:szCs w:val="20"/>
-        </w:rPr>
-        <w:t>beteurun</w:t>
-      </w:r>
-      <w:proofErr w:type="spellEnd"/>
-      <w:r>
-        <w:rPr>
-          <w:sz w:val="20"/>
-          <w:szCs w:val="20"/>
-        </w:rPr>
-        <w:t xml:space="preserve"> und </w:t>
-      </w:r>
-      <w:proofErr w:type="spellStart"/>
-      <w:r>
-        <w:rPr>
-          <w:sz w:val="20"/>
-          <w:szCs w:val="20"/>
-        </w:rPr>
-        <w:t>fehlerbehebung</w:t>
-      </w:r>
-      <w:proofErr w:type="spellEnd"/>
-      <w:r>
-        <w:rPr>
-          <w:sz w:val="20"/>
-          <w:szCs w:val="20"/>
-        </w:rPr>
-        <w:t xml:space="preserve"> der </w:t>
-      </w:r>
-      <w:proofErr w:type="spellStart"/>
-      <w:r>
-        <w:rPr>
-          <w:sz w:val="20"/>
-          <w:szCs w:val="20"/>
-        </w:rPr>
-        <w:t>Dms</w:t>
-      </w:r>
-      <w:proofErr w:type="spellEnd"/>
-      <w:r>
-        <w:rPr>
-          <w:sz w:val="20"/>
-          <w:szCs w:val="20"/>
-        </w:rPr>
-        <w:t xml:space="preserve">-Systeme und Server auf einige dritt </w:t>
-      </w:r>
-      <w:proofErr w:type="spellStart"/>
-      <w:r>
-        <w:rPr>
-          <w:sz w:val="20"/>
-          <w:szCs w:val="20"/>
-        </w:rPr>
-        <w:t>software</w:t>
-      </w:r>
-      <w:proofErr w:type="spellEnd"/>
-      <w:r>
-        <w:rPr>
-          <w:sz w:val="20"/>
-          <w:szCs w:val="20"/>
-        </w:rPr>
-        <w:t xml:space="preserve"> angewiesen. Auf das genaue software-produkt was in diesem </w:t>
-      </w:r>
-      <w:proofErr w:type="spellStart"/>
+        <w:t xml:space="preserve">Der Kunde für dieses Projekt ist die Support-Abteilung meines eigenen Betriebes, diese ist für ihre Aufgaben in der Verwaltung, beteurun und fehlerbehebung der Dms-Systeme und Server auf einige dritt software angewiesen. Auf das genaue software-produkt was in diesem </w:t>
+      </w:r>
       <w:proofErr w:type="gramStart"/>
       <w:r>
         <w:rPr>
@@ -1211,7 +1148,6 @@
         </w:rPr>
         <w:t>fall</w:t>
       </w:r>
-      <w:proofErr w:type="spellEnd"/>
       <w:proofErr w:type="gramEnd"/>
       <w:r>
         <w:rPr>
@@ -1316,71 +1252,7 @@
           <w:sz w:val="20"/>
           <w:szCs w:val="20"/>
         </w:rPr>
-        <w:t xml:space="preserve">) der Hersteller </w:t>
-      </w:r>
-      <w:proofErr w:type="spellStart"/>
-      <w:r>
-        <w:rPr>
-          <w:sz w:val="20"/>
-          <w:szCs w:val="20"/>
-        </w:rPr>
-        <w:t>otris</w:t>
-      </w:r>
-      <w:proofErr w:type="spellEnd"/>
-      <w:r>
-        <w:rPr>
-          <w:sz w:val="20"/>
-          <w:szCs w:val="20"/>
-        </w:rPr>
-        <w:t xml:space="preserve"> </w:t>
-      </w:r>
-      <w:proofErr w:type="spellStart"/>
-      <w:r>
-        <w:rPr>
-          <w:sz w:val="20"/>
-          <w:szCs w:val="20"/>
-        </w:rPr>
-        <w:t>software</w:t>
-      </w:r>
-      <w:proofErr w:type="spellEnd"/>
-      <w:r>
-        <w:rPr>
-          <w:sz w:val="20"/>
-          <w:szCs w:val="20"/>
-        </w:rPr>
-        <w:t xml:space="preserve"> AG (</w:t>
-      </w:r>
-      <w:proofErr w:type="spellStart"/>
-      <w:r>
-        <w:rPr>
-          <w:sz w:val="20"/>
-          <w:szCs w:val="20"/>
-        </w:rPr>
-        <w:t>otris</w:t>
-      </w:r>
-      <w:proofErr w:type="spellEnd"/>
-      <w:r>
-        <w:rPr>
-          <w:sz w:val="20"/>
-          <w:szCs w:val="20"/>
-        </w:rPr>
-        <w:t xml:space="preserve">) und EASY SOFTWARE AG (Easy AG). Das Kernziel dieser Lösungen ist die digitale Verwaltung sowie die revisionssichere Archivierung von Dokumenten. „Revisionssicher“ bedeutet in diesem Kontext, dass Dokumente unveränderbar, prüfbar und originalgetreu aufbewahrt werden, um den gesetzlichen Anforderungen der </w:t>
-      </w:r>
-      <w:proofErr w:type="spellStart"/>
-      <w:r>
-        <w:rPr>
-          <w:sz w:val="20"/>
-          <w:szCs w:val="20"/>
-        </w:rPr>
-        <w:t>GoBD</w:t>
-      </w:r>
-      <w:proofErr w:type="spellEnd"/>
-      <w:r>
-        <w:rPr>
-          <w:sz w:val="20"/>
-          <w:szCs w:val="20"/>
-        </w:rPr>
-        <w:t xml:space="preserve"> (Grundsätze zur ordnungsmäßigen Führung und Aufbewahrung von Büchern, Aufzeichnungen und Unterlagen in elektronischer Form sowie zum Datenzugriff) zu entsprechen.</w:t>
+        <w:t>) der Hersteller otris software AG (otris) und EASY SOFTWARE AG (Easy AG). Das Kernziel dieser Lösungen ist die digitale Verwaltung sowie die revisionssichere Archivierung von Dokumenten. „Revisionssicher“ bedeutet in diesem Kontext, dass Dokumente unveränderbar, prüfbar und originalgetreu aufbewahrt werden, um den gesetzlichen Anforderungen der GoBD (Grundsätze zur ordnungsmäßigen Führung und Aufbewahrung von Büchern, Aufzeichnungen und Unterlagen in elektronischer Form sowie zum Datenzugriff) zu entsprechen.</w:t>
       </w:r>
     </w:p>
     <w:p>
@@ -1469,23 +1341,7 @@
           <w:sz w:val="20"/>
           <w:szCs w:val="20"/>
         </w:rPr>
-        <w:t xml:space="preserve">Diese Struktur führt bei notwendigen Konfigurationsänderungen zu technischen Herausforderungen, da die Dienste aufgrund komplexer Abhängigkeiten nicht simultan neu gestartet werden können. Da der systemeigene Service Controller von Windows lediglich den Prozessstatus prüft, jedoch nicht die tatsächliche Erreichbarkeit der Schnittstellen validiert, reicht dieser zur Verwaltung der Abhängigkeiten nicht aus. In der Praxis führt dies dazu, dass </w:t>
-      </w:r>
-      <w:proofErr w:type="spellStart"/>
-      <w:r>
-        <w:rPr>
-          <w:sz w:val="20"/>
-          <w:szCs w:val="20"/>
-        </w:rPr>
-        <w:t>Backends</w:t>
-      </w:r>
-      <w:proofErr w:type="spellEnd"/>
-      <w:r>
-        <w:rPr>
-          <w:sz w:val="20"/>
-          <w:szCs w:val="20"/>
-        </w:rPr>
-        <w:t xml:space="preserve"> versuchen, einen SQL-Server zu adressieren, der zwar als „gestartet“ markiert, jedoch noch nicht vollständig initialisiert ist. Infolgedessen schlagen die Verbindungsversuche fehl, woraufhin die Backend-Dienste automatisiert herunterfahren. Aufgrund dieser fehlerhaften Dienst-Synchronisation gestaltet sich jede Konfiguration als äußerst zeitintensiv. Da jeder </w:t>
+        <w:t xml:space="preserve">Diese Struktur führt bei notwendigen Konfigurationsänderungen zu technischen Herausforderungen, da die Dienste aufgrund komplexer Abhängigkeiten nicht simultan neu gestartet werden können. Da der systemeigene Service Controller von Windows lediglich den Prozessstatus prüft, jedoch nicht die tatsächliche Erreichbarkeit der Schnittstellen validiert, reicht dieser zur Verwaltung der Abhängigkeiten nicht aus. In der Praxis führt dies dazu, dass Backends versuchen, einen SQL-Server zu adressieren, der zwar als „gestartet“ markiert, jedoch noch nicht vollständig initialisiert ist. Infolgedessen schlagen die Verbindungsversuche fehl, woraufhin die Backend-Dienste automatisiert herunterfahren. Aufgrund dieser fehlerhaften Dienst-Synchronisation gestaltet sich jede Konfiguration als äußerst zeitintensiv. Da jeder </w:t>
       </w:r>
       <w:r>
         <w:rPr>
@@ -1512,7 +1368,14 @@
         <w:t xml:space="preserve"> pro Arbeitstag.</w:t>
       </w:r>
     </w:p>
-    <w:p/>
+    <w:p>
+      <w:pPr>
+        <w:rPr>
+          <w:sz w:val="20"/>
+          <w:szCs w:val="20"/>
+        </w:rPr>
+      </w:pPr>
+    </w:p>
     <w:p>
       <w:pPr>
         <w:pStyle w:val="berschrift2"/>
@@ -1619,7 +1482,6 @@
         </w:rPr>
         <w:t xml:space="preserve">Name: </w:t>
       </w:r>
-      <w:proofErr w:type="spellStart"/>
       <w:r>
         <w:rPr>
           <w:sz w:val="20"/>
@@ -1627,7 +1489,6 @@
         </w:rPr>
         <w:t>A.Schütz</w:t>
       </w:r>
-      <w:proofErr w:type="spellEnd"/>
       <w:r>
         <w:rPr>
           <w:sz w:val="20"/>
@@ -1791,7 +1652,7 @@
         </w:rPr>
         <w:t xml:space="preserve">E-Mail: </w:t>
       </w:r>
-      <w:hyperlink r:id="rId5" w:history="1">
+      <w:hyperlink r:id="rId7" w:history="1">
         <w:r>
           <w:rPr>
             <w:rStyle w:val="Hyperlink"/>
@@ -1873,7 +1734,6 @@
         </w:rPr>
         <w:t xml:space="preserve">) dient Visual Studio. Es ist für die .NET-Entwicklung optimiert und bietet einen visuellen Designer für Oberflächen. Zudem bietet es mächtige Templates, welche den manuellen Programmieraufwand reduzieren. Die Versionsverwaltung erfolgt über </w:t>
       </w:r>
-      <w:proofErr w:type="spellStart"/>
       <w:r>
         <w:rPr>
           <w:b/>
@@ -1883,7 +1743,6 @@
         </w:rPr>
         <w:t>Git</w:t>
       </w:r>
-      <w:proofErr w:type="spellEnd"/>
       <w:r>
         <w:rPr>
           <w:sz w:val="20"/>
@@ -1924,7 +1783,6 @@
         </w:rPr>
         <w:t>Ich nutze das „Worker Service“-Template für den Hintergrunddienst. Das Template implementiert die „</w:t>
       </w:r>
-      <w:proofErr w:type="spellStart"/>
       <w:proofErr w:type="gramStart"/>
       <w:r>
         <w:rPr>
@@ -1933,7 +1791,6 @@
         </w:rPr>
         <w:t>Microsoft.Extensions.Hosting</w:t>
       </w:r>
-      <w:proofErr w:type="spellEnd"/>
       <w:proofErr w:type="gramEnd"/>
       <w:r>
         <w:rPr>
@@ -1958,7 +1815,6 @@
         <w:lastRenderedPageBreak/>
         <w:t xml:space="preserve">Für die Steuerung der Dienste werde ich die Klasse </w:t>
       </w:r>
-      <w:proofErr w:type="spellStart"/>
       <w:proofErr w:type="gramStart"/>
       <w:r>
         <w:rPr>
@@ -1967,7 +1823,6 @@
         </w:rPr>
         <w:t>System.ServiceProcess.ServiceController</w:t>
       </w:r>
-      <w:proofErr w:type="spellEnd"/>
       <w:proofErr w:type="gramEnd"/>
       <w:r>
         <w:rPr>
@@ -1989,17 +1844,8 @@
           <w:sz w:val="20"/>
           <w:szCs w:val="20"/>
         </w:rPr>
-        <w:t xml:space="preserve">Die grafische Oberfläche wird mithilfe des Windows Presentation </w:t>
-      </w:r>
-      <w:proofErr w:type="spellStart"/>
-      <w:r>
-        <w:rPr>
-          <w:sz w:val="20"/>
-          <w:szCs w:val="20"/>
-        </w:rPr>
-        <w:t>Foundation</w:t>
-      </w:r>
-      <w:proofErr w:type="spellEnd"/>
+        <w:t>Die grafische Oberfläche wird mithilfe des Windows Presentation Foundation</w:t>
+      </w:r>
       <w:r>
         <w:rPr>
           <w:b/>
@@ -2014,70 +1860,22 @@
           <w:sz w:val="20"/>
           <w:szCs w:val="20"/>
         </w:rPr>
-        <w:t xml:space="preserve"> realisiert. Um eine intuitive Bedienung zu ermöglichen, implementiere ich eine Doppelauswahlliste. Da WPF dieses Element nicht nativ unterstützt, nutze ich die Bibliothek „gong-</w:t>
-      </w:r>
-      <w:proofErr w:type="spellStart"/>
-      <w:r>
-        <w:rPr>
-          <w:sz w:val="20"/>
-          <w:szCs w:val="20"/>
-        </w:rPr>
-        <w:t>wpf</w:t>
-      </w:r>
-      <w:proofErr w:type="spellEnd"/>
-      <w:r>
-        <w:rPr>
-          <w:sz w:val="20"/>
-          <w:szCs w:val="20"/>
-        </w:rPr>
-        <w:t>-</w:t>
-      </w:r>
-      <w:proofErr w:type="spellStart"/>
-      <w:r>
-        <w:rPr>
-          <w:sz w:val="20"/>
-          <w:szCs w:val="20"/>
-        </w:rPr>
-        <w:t>dragdrop</w:t>
-      </w:r>
-      <w:proofErr w:type="spellEnd"/>
-      <w:r>
-        <w:rPr>
-          <w:sz w:val="20"/>
-          <w:szCs w:val="20"/>
-        </w:rPr>
-        <w:t>“. Diese liefert die notwendigen UI-Elemente und die Logik für die Synchronisierung der Datenmodelle per Drag &amp; Drop.</w:t>
-      </w:r>
-    </w:p>
-    <w:p>
-      <w:pPr>
-        <w:rPr>
-          <w:sz w:val="20"/>
-          <w:szCs w:val="20"/>
-        </w:rPr>
-      </w:pPr>
-      <w:r>
-        <w:rPr>
-          <w:sz w:val="20"/>
-          <w:szCs w:val="20"/>
-        </w:rPr>
-        <w:t xml:space="preserve">Zur Lösung des Kernproblems – der Erreichbarkeitsprüfung – wird zudem die Bibliothek </w:t>
-      </w:r>
-      <w:proofErr w:type="spellStart"/>
-      <w:r>
-        <w:rPr>
-          <w:sz w:val="20"/>
-          <w:szCs w:val="20"/>
-        </w:rPr>
-        <w:t>System.Net.Sockets</w:t>
-      </w:r>
-      <w:proofErr w:type="spellEnd"/>
-      <w:r>
-        <w:rPr>
-          <w:sz w:val="20"/>
-          <w:szCs w:val="20"/>
-        </w:rPr>
-        <w:t xml:space="preserve"> verwendet. Mit ihr wird geprüft, ob die notwendigen Netzwerk-Ports der Dienste (z. B. SQL-Server) tatsächlich aktiv sind.</w:t>
+        <w:t xml:space="preserve"> realisiert. Um eine intuitive Bedienung zu ermöglichen, implementiere ich eine Doppelauswahlliste. Da WPF dieses Element nicht nativ unterstützt, nutze ich die Bibliothek „gong-wpf-dragdrop“. Diese liefert die notwendigen UI-Elemente und die Logik für die Synchronisierung der Datenmodelle per Drag &amp; Drop.</w:t>
+      </w:r>
+    </w:p>
+    <w:p>
+      <w:pPr>
+        <w:rPr>
+          <w:sz w:val="20"/>
+          <w:szCs w:val="20"/>
+        </w:rPr>
+      </w:pPr>
+      <w:r>
+        <w:rPr>
+          <w:sz w:val="20"/>
+          <w:szCs w:val="20"/>
+        </w:rPr>
+        <w:t>Zur Lösung des Kernproblems – der Erreichbarkeitsprüfung – wird zudem die Bibliothek System.Net.Sockets verwendet. Mit ihr wird geprüft, ob die notwendigen Netzwerk-Ports der Dienste (z. B. SQL-Server) tatsächlich aktiv sind.</w:t>
       </w:r>
     </w:p>
     <w:p/>
@@ -2294,23 +2092,7 @@
           <w:sz w:val="20"/>
           <w:szCs w:val="20"/>
         </w:rPr>
-        <w:t>Die Software verfolgt zwei Hauptziele. Erstens soll eine „</w:t>
-      </w:r>
-      <w:proofErr w:type="spellStart"/>
-      <w:r>
-        <w:rPr>
-          <w:sz w:val="20"/>
-          <w:szCs w:val="20"/>
-        </w:rPr>
-        <w:t>One</w:t>
-      </w:r>
-      <w:proofErr w:type="spellEnd"/>
-      <w:r>
-        <w:rPr>
-          <w:sz w:val="20"/>
-          <w:szCs w:val="20"/>
-        </w:rPr>
-        <w:t>-Click“-Automatisierung den Startprozess koordinieren. Die Anwendung verwaltet dabei alle Abhängigkeiten eigenständig. Dienste fahren automatisch hoch, ohne durch nicht erreichbare Schnittstellen in Fehlerzustände zu geraten. Zweitens stellt die Anwendung den Dauerbetrieb sicher. Sie prüft permanent, ob die geforderten Dienste laufen. Sollten diese während der Laufzeit ausfallen, startet die Software sie automatisch neu.</w:t>
+        <w:t>Die Software verfolgt zwei Hauptziele. Erstens soll eine „One-Click“-Automatisierung den Startprozess koordinieren. Die Anwendung verwaltet dabei alle Abhängigkeiten eigenständig. Dienste fahren automatisch hoch, ohne durch nicht erreichbare Schnittstellen in Fehlerzustände zu geraten. Zweitens stellt die Anwendung den Dauerbetrieb sicher. Sie prüft permanent, ob die geforderten Dienste laufen. Sollten diese während der Laufzeit ausfallen, startet die Software sie automatisch neu.</w:t>
       </w:r>
     </w:p>
     <w:p>
@@ -2401,7 +2183,6 @@
         </w:rPr>
         <w:t xml:space="preserve">Die Anwendung richtet sich an technisch versiertes Personal. Dabei müssen zwei unterschiedliche Anwendergruppen berücksichtigt </w:t>
       </w:r>
-      <w:proofErr w:type="spellStart"/>
       <w:proofErr w:type="gramStart"/>
       <w:r>
         <w:rPr>
@@ -2410,30 +2191,13 @@
         </w:rPr>
         <w:t>werden.Für</w:t>
       </w:r>
-      <w:proofErr w:type="spellEnd"/>
       <w:proofErr w:type="gramEnd"/>
       <w:r>
         <w:rPr>
           <w:sz w:val="20"/>
           <w:szCs w:val="20"/>
         </w:rPr>
-        <w:t xml:space="preserve"> Entwickler muss die Software per Datei konfigurierbar sein. Systemadministratoren fordern hingegen eine Bedienung per grafischer Oberfläche. Daher wird die Anwendung in einem „</w:t>
-      </w:r>
-      <w:proofErr w:type="spellStart"/>
-      <w:r>
-        <w:rPr>
-          <w:sz w:val="20"/>
-          <w:szCs w:val="20"/>
-        </w:rPr>
-        <w:t>Headless</w:t>
-      </w:r>
-      <w:proofErr w:type="spellEnd"/>
-      <w:r>
-        <w:rPr>
-          <w:sz w:val="20"/>
-          <w:szCs w:val="20"/>
-        </w:rPr>
-        <w:t>-Design“ realisiert. Das System besteht somit aus einem Hintergrunddienst ohne eigene grafische Oberfläche. Dieser bezieht seine Konfiguration aus einer Datei, welche entweder direkt bearbeitet oder über eine separate grafische Oberfläche erstellt und bearbeitet werden kann.</w:t>
+        <w:t xml:space="preserve"> Entwickler muss die Software per Datei konfigurierbar sein. Systemadministratoren fordern hingegen eine Bedienung per grafischer Oberfläche. Daher wird die Anwendung in einem „Headless-Design“ realisiert. Das System besteht somit aus einem Hintergrunddienst ohne eigene grafische Oberfläche. Dieser bezieht seine Konfiguration aus einer Datei, welche entweder direkt bearbeitet oder über eine separate grafische Oberfläche erstellt und bearbeitet werden kann.</w:t>
       </w:r>
     </w:p>
     <w:p>
@@ -2622,55 +2386,7 @@
           <w:sz w:val="20"/>
           <w:szCs w:val="20"/>
         </w:rPr>
-        <w:t xml:space="preserve">Zur Sicherstellung der Abnahmebereitschaft entwickle ich eine messbare Metrik in Form einer Definition </w:t>
-      </w:r>
-      <w:proofErr w:type="spellStart"/>
-      <w:r>
-        <w:rPr>
-          <w:sz w:val="20"/>
-          <w:szCs w:val="20"/>
-        </w:rPr>
-        <w:t>of</w:t>
-      </w:r>
-      <w:proofErr w:type="spellEnd"/>
-      <w:r>
-        <w:rPr>
-          <w:sz w:val="20"/>
-          <w:szCs w:val="20"/>
-        </w:rPr>
-        <w:t xml:space="preserve"> Done. Da die bloße Definition von Funktionalität noch keine Messbarkeit garantiert, müssen die Kriterien der Definition </w:t>
-      </w:r>
-      <w:proofErr w:type="spellStart"/>
-      <w:r>
-        <w:rPr>
-          <w:sz w:val="20"/>
-          <w:szCs w:val="20"/>
-        </w:rPr>
-        <w:t>of</w:t>
-      </w:r>
-      <w:proofErr w:type="spellEnd"/>
-      <w:r>
-        <w:rPr>
-          <w:sz w:val="20"/>
-          <w:szCs w:val="20"/>
-        </w:rPr>
-        <w:t xml:space="preserve"> Done den verkürzten SMART-Anforderungen genügen. Sie sind somit spezifisch, messbar und realistisch formuliert. In der Testdefinition lege ich besonderen Wert darauf, dass jeder Testfall einer expliziten Anforderung zugeordnet ist. Diese bidirektionale Verknüpfung, auch als </w:t>
-      </w:r>
-      <w:proofErr w:type="spellStart"/>
-      <w:r>
-        <w:rPr>
-          <w:sz w:val="20"/>
-          <w:szCs w:val="20"/>
-        </w:rPr>
-        <w:t>Traceability</w:t>
-      </w:r>
-      <w:proofErr w:type="spellEnd"/>
-      <w:r>
-        <w:rPr>
-          <w:sz w:val="20"/>
-          <w:szCs w:val="20"/>
-        </w:rPr>
-        <w:t xml:space="preserve"> bezeichnet, erfüllt zwei zentrale Aufgaben. Einerseits verhindert sie einen sogenannten Scope </w:t>
+        <w:t xml:space="preserve">Zur Sicherstellung der Abnahmebereitschaft entwickle ich eine messbare Metrik in Form einer Definition of Done. Da die bloße Definition von Funktionalität noch keine Messbarkeit garantiert, müssen die Kriterien der Definition of Done den verkürzten SMART-Anforderungen genügen. Sie sind somit spezifisch, messbar und realistisch formuliert. In der Testdefinition lege ich besonderen Wert darauf, dass jeder Testfall einer expliziten Anforderung zugeordnet ist. Diese bidirektionale Verknüpfung, auch als Traceability bezeichnet, erfüllt zwei zentrale Aufgaben. Einerseits verhindert sie einen sogenannten Scope </w:t>
       </w:r>
       <w:r>
         <w:rPr>
@@ -2745,55 +2461,7 @@
           <w:sz w:val="20"/>
           <w:szCs w:val="20"/>
         </w:rPr>
-        <w:t xml:space="preserve">Agile Methoden wie </w:t>
-      </w:r>
-      <w:proofErr w:type="spellStart"/>
-      <w:r>
-        <w:rPr>
-          <w:sz w:val="20"/>
-          <w:szCs w:val="20"/>
-        </w:rPr>
-        <w:t>Scrum</w:t>
-      </w:r>
-      <w:proofErr w:type="spellEnd"/>
-      <w:r>
-        <w:rPr>
-          <w:sz w:val="20"/>
-          <w:szCs w:val="20"/>
-        </w:rPr>
-        <w:t xml:space="preserve"> wurden aufgrund der Rahmenbedingungen verworfen. </w:t>
-      </w:r>
-      <w:proofErr w:type="spellStart"/>
-      <w:r>
-        <w:rPr>
-          <w:sz w:val="20"/>
-          <w:szCs w:val="20"/>
-        </w:rPr>
-        <w:t>Scrum</w:t>
-      </w:r>
-      <w:proofErr w:type="spellEnd"/>
-      <w:r>
-        <w:rPr>
-          <w:sz w:val="20"/>
-          <w:szCs w:val="20"/>
-        </w:rPr>
-        <w:t xml:space="preserve"> ist primär auf die Zusammenarbeit in Teams sowie auf eine feedbackgetriebene, iterative Entwicklung ausgelegt. Da ich dieses Projekt als einzelner Entwickler durchführe und sowohl der Zeithorizont als auch die Anforderungen durch den Projektantrag fest definiert sind, bieten die Flexibilität und die Zeremonien agiler Frameworks keinen Mehrwert. Auch das Spiralmodell erschien ungeeignet. Zwar liegen dessen Stärken in der Risikominimierung durch </w:t>
-      </w:r>
-      <w:proofErr w:type="spellStart"/>
-      <w:r>
-        <w:rPr>
-          <w:sz w:val="20"/>
-          <w:szCs w:val="20"/>
-        </w:rPr>
-        <w:t>Prototyping</w:t>
-      </w:r>
-      <w:proofErr w:type="spellEnd"/>
-      <w:r>
-        <w:rPr>
-          <w:sz w:val="20"/>
-          <w:szCs w:val="20"/>
-        </w:rPr>
-        <w:t>, jedoch sind die Anforderungen bereits zu Projektbeginn klar definiert, wodurch ein rein risikogetriebener Ansatz künstlich wirken und das knappe Zeitbudget durch iterative Schleifen unnötig belasten würde.</w:t>
+        <w:t>Agile Methoden wie Scrum wurden aufgrund der Rahmenbedingungen verworfen. Scrum ist primär auf die Zusammenarbeit in Teams sowie auf eine feedbackgetriebene, iterative Entwicklung ausgelegt. Da ich dieses Projekt als einzelner Entwickler durchführe und sowohl der Zeithorizont als auch die Anforderungen durch den Projektantrag fest definiert sind, bieten die Flexibilität und die Zeremonien agiler Frameworks keinen Mehrwert. Auch das Spiralmodell erschien ungeeignet. Zwar liegen dessen Stärken in der Risikominimierung durch Prototyping, jedoch sind die Anforderungen bereits zu Projektbeginn klar definiert, wodurch ein rein risikogetriebener Ansatz künstlich wirken und das knappe Zeitbudget durch iterative Schleifen unnötig belasten würde.</w:t>
       </w:r>
     </w:p>
     <w:p>
@@ -2938,8 +2606,11 @@
     </w:p>
     <w:p>
       <w:r>
+        <w:rPr>
+          <w:noProof/>
+        </w:rPr>
         <w:drawing>
-          <wp:inline distT="0" distB="0" distL="0" distR="0" wp14:anchorId="5741534A" wp14:editId="63F88AD8">
+          <wp:inline distT="0" distB="0" distL="0" distR="0" wp14:anchorId="5741534A" wp14:editId="2906E91E">
             <wp:extent cx="6159261" cy="3459452"/>
             <wp:effectExtent l="0" t="0" r="0" b="0"/>
             <wp:docPr id="1951662694" name="Grafik 2"/>
@@ -2956,7 +2627,7 @@
                     </pic:cNvPicPr>
                   </pic:nvPicPr>
                   <pic:blipFill>
-                    <a:blip r:embed="rId6" cstate="print">
+                    <a:blip r:embed="rId8" cstate="print">
                       <a:extLst>
                         <a:ext uri="{28A0092B-C50C-407E-A947-70E740481C1C}">
                           <a14:useLocalDpi xmlns:a14="http://schemas.microsoft.com/office/drawing/2010/main" val="0"/>
@@ -3143,23 +2814,7 @@
           <w:sz w:val="20"/>
           <w:szCs w:val="20"/>
         </w:rPr>
-        <w:t xml:space="preserve">In dieser Phase lege ich die konkreten Anforderungen fest, die jede Komponente individuell erfüllen muss. Für meine Anwendung sind dies primär die Anforderungen an den Worker sowie die grafische Benutzeroberfläche. Ich definiere die Funktionen und qualitativen Ziele, die der jeweilige Baustein isoliert betrachtet leisten muss. Zur Sicherstellung der Vollständigkeit und zur Vermeidung von Planungsfehlern erstelle ich eine </w:t>
-      </w:r>
-      <w:proofErr w:type="spellStart"/>
-      <w:r>
-        <w:rPr>
-          <w:sz w:val="20"/>
-          <w:szCs w:val="20"/>
-        </w:rPr>
-        <w:t>Traceability</w:t>
-      </w:r>
-      <w:proofErr w:type="spellEnd"/>
-      <w:r>
-        <w:rPr>
-          <w:sz w:val="20"/>
-          <w:szCs w:val="20"/>
-        </w:rPr>
-        <w:t>-Tabelle. Diese belegt lückenlos, dass jede Systemanforderung durch mindestens eine Komponente abgedeckt wird. Dieser Ebene steht der Komponententest gegenüber, welcher die korrekte Umsetzung der modulspezifischen Anforderungen verifiziert.</w:t>
+        <w:t>In dieser Phase lege ich die konkreten Anforderungen fest, die jede Komponente individuell erfüllen muss. Für meine Anwendung sind dies primär die Anforderungen an den Worker sowie die grafische Benutzeroberfläche. Ich definiere die Funktionen und qualitativen Ziele, die der jeweilige Baustein isoliert betrachtet leisten muss. Zur Sicherstellung der Vollständigkeit und zur Vermeidung von Planungsfehlern erstelle ich eine Traceability-Tabelle. Diese belegt lückenlos, dass jede Systemanforderung durch mindestens eine Komponente abgedeckt wird. Dieser Ebene steht der Komponententest gegenüber, welcher die korrekte Umsetzung der modulspezifischen Anforderungen verifiziert.</w:t>
       </w:r>
     </w:p>
     <w:p>
@@ -3565,102 +3220,22 @@
           <w:sz w:val="20"/>
           <w:szCs w:val="20"/>
         </w:rPr>
-        <w:t xml:space="preserve">Die Priorisierung ist formal den ersten beiden Phasen meines Entwicklungsmodells zugeordnet. In diesem Schritt priorisiere ich die erarbeiteten Systemanforderungen auf Basis der identifizierten Benutzerbedürfnisse. Zur methodischen Einordnung verwende ich die </w:t>
-      </w:r>
-      <w:proofErr w:type="spellStart"/>
-      <w:r>
-        <w:rPr>
-          <w:sz w:val="20"/>
-          <w:szCs w:val="20"/>
-        </w:rPr>
-        <w:t>MoSCoW</w:t>
-      </w:r>
-      <w:proofErr w:type="spellEnd"/>
-      <w:r>
-        <w:rPr>
-          <w:sz w:val="20"/>
-          <w:szCs w:val="20"/>
-        </w:rPr>
-        <w:t xml:space="preserve">-Methode. Diese erlaubt eine Kategorisierung der Anforderungen in Must-have, </w:t>
-      </w:r>
-      <w:proofErr w:type="spellStart"/>
-      <w:r>
-        <w:rPr>
-          <w:sz w:val="20"/>
-          <w:szCs w:val="20"/>
-        </w:rPr>
-        <w:t>Should-have</w:t>
-      </w:r>
-      <w:proofErr w:type="spellEnd"/>
-      <w:r>
-        <w:rPr>
-          <w:sz w:val="20"/>
-          <w:szCs w:val="20"/>
-        </w:rPr>
-        <w:t xml:space="preserve">, </w:t>
-      </w:r>
-      <w:proofErr w:type="spellStart"/>
-      <w:r>
-        <w:rPr>
-          <w:sz w:val="20"/>
-          <w:szCs w:val="20"/>
-        </w:rPr>
-        <w:t>Could-have</w:t>
-      </w:r>
-      <w:proofErr w:type="spellEnd"/>
-      <w:r>
-        <w:rPr>
-          <w:sz w:val="20"/>
-          <w:szCs w:val="20"/>
-        </w:rPr>
-        <w:t xml:space="preserve"> und </w:t>
-      </w:r>
-      <w:proofErr w:type="spellStart"/>
-      <w:r>
-        <w:rPr>
-          <w:sz w:val="20"/>
-          <w:szCs w:val="20"/>
-        </w:rPr>
-        <w:t>Won’t-have</w:t>
-      </w:r>
-      <w:proofErr w:type="spellEnd"/>
-      <w:r>
-        <w:rPr>
-          <w:sz w:val="20"/>
-          <w:szCs w:val="20"/>
-        </w:rPr>
-        <w:t>.</w:t>
-      </w:r>
-    </w:p>
-    <w:p>
-      <w:pPr>
-        <w:rPr>
-          <w:sz w:val="20"/>
-          <w:szCs w:val="20"/>
-        </w:rPr>
-      </w:pPr>
-      <w:r>
-        <w:rPr>
-          <w:sz w:val="20"/>
-          <w:szCs w:val="20"/>
-        </w:rPr>
-        <w:t xml:space="preserve">Gesondert zu betrachten ist hierbei die Kategorie </w:t>
-      </w:r>
-      <w:proofErr w:type="spellStart"/>
-      <w:r>
-        <w:rPr>
-          <w:sz w:val="20"/>
-          <w:szCs w:val="20"/>
-        </w:rPr>
-        <w:t>Won’t-have</w:t>
-      </w:r>
-      <w:proofErr w:type="spellEnd"/>
-      <w:r>
-        <w:rPr>
-          <w:sz w:val="20"/>
-          <w:szCs w:val="20"/>
-        </w:rPr>
-        <w:t>. Diese dient der expliziten Projektabgrenzung. Durch die Definition eines solchen negativen Scopes verhindere ich das Entstehen impliziter Erwartungen während des Projektverlaufs. Die Priorisierung ist somit ein wesentliches Instrument, um einem unkontrollierten Anwachsen des Projektumfangs, dem sogenannten Scope Creep, entgegenzuwirken.</w:t>
+        <w:t>Die Priorisierung ist formal den ersten beiden Phasen meines Entwicklungsmodells zugeordnet. In diesem Schritt priorisiere ich die erarbeiteten Systemanforderungen auf Basis der identifizierten Benutzerbedürfnisse. Zur methodischen Einordnung verwende ich die MoSCoW-Methode. Diese erlaubt eine Kategorisierung der Anforderungen in Must-have, Should-have, Could-have und Won’t-have.</w:t>
+      </w:r>
+    </w:p>
+    <w:p>
+      <w:pPr>
+        <w:rPr>
+          <w:sz w:val="20"/>
+          <w:szCs w:val="20"/>
+        </w:rPr>
+      </w:pPr>
+      <w:r>
+        <w:rPr>
+          <w:sz w:val="20"/>
+          <w:szCs w:val="20"/>
+        </w:rPr>
+        <w:t>Gesondert zu betrachten ist hierbei die Kategorie Won’t-have. Diese dient der expliziten Projektabgrenzung. Durch die Definition eines solchen negativen Scopes verhindere ich das Entstehen impliziter Erwartungen während des Projektverlaufs. Die Priorisierung ist somit ein wesentliches Instrument, um einem unkontrollierten Anwachsen des Projektumfangs, dem sogenannten Scope Creep, entgegenzuwirken.</w:t>
       </w:r>
     </w:p>
     <w:p>
@@ -3692,49 +3267,22 @@
           <w:sz w:val="20"/>
           <w:szCs w:val="20"/>
         </w:rPr>
-        <w:t xml:space="preserve">3.4 </w:t>
-      </w:r>
-      <w:proofErr w:type="spellStart"/>
-      <w:r>
-        <w:rPr>
-          <w:b/>
-          <w:bCs/>
-          <w:sz w:val="20"/>
-          <w:szCs w:val="20"/>
-        </w:rPr>
-        <w:t>Traceability</w:t>
-      </w:r>
-      <w:proofErr w:type="spellEnd"/>
-    </w:p>
-    <w:p>
-      <w:pPr>
-        <w:rPr>
-          <w:sz w:val="20"/>
-          <w:szCs w:val="20"/>
-        </w:rPr>
-      </w:pPr>
-      <w:r>
-        <w:rPr>
-          <w:sz w:val="20"/>
-          <w:szCs w:val="20"/>
-        </w:rPr>
-        <w:t xml:space="preserve">Die </w:t>
-      </w:r>
-      <w:proofErr w:type="spellStart"/>
-      <w:r>
-        <w:rPr>
-          <w:sz w:val="20"/>
-          <w:szCs w:val="20"/>
-        </w:rPr>
-        <w:t>Traceability</w:t>
-      </w:r>
-      <w:proofErr w:type="spellEnd"/>
-      <w:r>
-        <w:rPr>
-          <w:sz w:val="20"/>
-          <w:szCs w:val="20"/>
-        </w:rPr>
-        <w:t xml:space="preserve"> ist primär der ersten Phase der Benutzeranforderungen zugeordnet. Sie dient in der späteren Abnahmephase als Nachweis dafür, dass sämtliche Systemanforderungen konsistent aus den ursprünglichen Stakeholder-Anforderungen abgeleitet wurden. Damit belege ich objektiv, dass das fertige System vollumfänglich den Anforderungen des Kunden entspricht. Ich stelle somit sicher, dass die Umsetzung nicht lediglich der Interpretation der Entwickler entspringt.</w:t>
+        <w:t>3.4 Traceability</w:t>
+      </w:r>
+    </w:p>
+    <w:p>
+      <w:pPr>
+        <w:rPr>
+          <w:sz w:val="20"/>
+          <w:szCs w:val="20"/>
+        </w:rPr>
+      </w:pPr>
+      <w:r>
+        <w:rPr>
+          <w:sz w:val="20"/>
+          <w:szCs w:val="20"/>
+        </w:rPr>
+        <w:t>Die Traceability ist primär der ersten Phase der Benutzeranforderungen zugeordnet. Sie dient in der späteren Abnahmephase als Nachweis dafür, dass sämtliche Systemanforderungen konsistent aus den ursprünglichen Stakeholder-Anforderungen abgeleitet wurden. Damit belege ich objektiv, dass das fertige System vollumfänglich den Anforderungen des Kunden entspricht. Ich stelle somit sicher, dass die Umsetzung nicht lediglich der Interpretation der Entwickler entspringt.</w:t>
       </w:r>
     </w:p>
     <w:p>
@@ -3758,74 +3306,463 @@
           <w:sz w:val="20"/>
           <w:szCs w:val="20"/>
         </w:rPr>
-        <w:t xml:space="preserve"> der Rückverfolgbarkeit wird meist als vertikale </w:t>
-      </w:r>
-      <w:proofErr w:type="spellStart"/>
-      <w:r>
-        <w:rPr>
-          <w:sz w:val="20"/>
-          <w:szCs w:val="20"/>
-        </w:rPr>
-        <w:t>Traceability</w:t>
-      </w:r>
-      <w:proofErr w:type="spellEnd"/>
-      <w:r>
-        <w:rPr>
-          <w:sz w:val="20"/>
-          <w:szCs w:val="20"/>
-        </w:rPr>
-        <w:t xml:space="preserve"> bezeichnet, da hierbei die Elemente der übergeordneten Ebene der Stakeholder-Anforderungen den Elementen der untergeordneten Systemanforderungen zugeordnet werden. Durch diese Methodik stelle ich sicher, dass jede technische Umsetzung einen validen fachlichen Ursprung besitzt und verhindere die Implementierung nicht autorisierter Funktionalitäten.</w:t>
-      </w:r>
-    </w:p>
-    <w:p>
-      <w:pPr>
-        <w:rPr>
-          <w:sz w:val="20"/>
-          <w:szCs w:val="20"/>
-        </w:rPr>
-      </w:pPr>
-      <w:r>
-        <w:rPr>
-          <w:sz w:val="20"/>
-          <w:szCs w:val="20"/>
-        </w:rPr>
-        <w:t xml:space="preserve">Davon abgegrenzt betrachte ich die horizontale </w:t>
-      </w:r>
-      <w:proofErr w:type="spellStart"/>
-      <w:r>
-        <w:rPr>
-          <w:sz w:val="20"/>
-          <w:szCs w:val="20"/>
-        </w:rPr>
-        <w:t>Traceability</w:t>
-      </w:r>
-      <w:proofErr w:type="spellEnd"/>
-      <w:r>
-        <w:rPr>
-          <w:sz w:val="20"/>
-          <w:szCs w:val="20"/>
-        </w:rPr>
-        <w:t xml:space="preserve">. Diese beschreibt die Zuordnung der einzelnen Projektphasen zu den entsprechenden Testinstanzen gemäß dem W-Modell. Da die horizontale </w:t>
-      </w:r>
-      <w:proofErr w:type="spellStart"/>
-      <w:r>
-        <w:rPr>
-          <w:sz w:val="20"/>
-          <w:szCs w:val="20"/>
-        </w:rPr>
-        <w:t>Traceability</w:t>
-      </w:r>
-      <w:proofErr w:type="spellEnd"/>
-      <w:r>
-        <w:rPr>
-          <w:sz w:val="20"/>
-          <w:szCs w:val="20"/>
-        </w:rPr>
-        <w:t xml:space="preserve"> die systematische Überprüfung der jeweiligen Phasen durch spezifische Tests sicherstellt, dokumentiere ich diese Verknüpfungen detailliert innerhalb der Testdefinitionen der jeweiligen Projektphasen.</w:t>
+        <w:t xml:space="preserve"> der Rückverfolgbarkeit wird meist als vertikale Traceability bezeichnet, da hierbei die Elemente der übergeordneten Ebene der Stakeholder-Anforderungen den Elementen der untergeordneten Systemanforderungen zugeordnet werden. Durch diese Methodik stelle ich sicher, dass jede technische Umsetzung einen validen fachlichen Ursprung besitzt und verhindere die Implementierung nicht autorisierter Funktionalitäten.</w:t>
+      </w:r>
+    </w:p>
+    <w:p>
+      <w:pPr>
+        <w:rPr>
+          <w:sz w:val="20"/>
+          <w:szCs w:val="20"/>
+        </w:rPr>
+      </w:pPr>
+      <w:r>
+        <w:rPr>
+          <w:sz w:val="20"/>
+          <w:szCs w:val="20"/>
+        </w:rPr>
+        <w:t>Davon abgegrenzt betrachte ich die horizontale Traceability. Diese beschreibt die Zuordnung der einzelnen Projektphasen zu den entsprechenden Testinstanzen gemäß dem W-Modell. Da die horizontale Traceability die systematische Überprüfung der jeweiligen Phasen durch spezifische Tests sicherstellt, dokumentiere ich diese Verknüpfungen detailliert innerhalb der Testdefinitionen der jeweiligen Projektphasen.</w:t>
+      </w:r>
+    </w:p>
+    <w:p>
+      <w:pPr>
+        <w:pStyle w:val="berschrift1"/>
+      </w:pPr>
+      <w:r>
+        <w:lastRenderedPageBreak/>
+        <w:t>Umsetzung</w:t>
+      </w:r>
+    </w:p>
+    <w:p>
+      <w:pPr>
+        <w:pStyle w:val="berschrift2"/>
+      </w:pPr>
+      <w:r>
+        <w:t>Phase 1: Benutzeranforderungen</w:t>
+      </w:r>
+    </w:p>
+    <w:p>
+      <w:pPr>
+        <w:rPr>
+          <w:sz w:val="20"/>
+          <w:szCs w:val="20"/>
+        </w:rPr>
+      </w:pPr>
+      <w:r>
+        <w:rPr>
+          <w:sz w:val="20"/>
+          <w:szCs w:val="20"/>
+        </w:rPr>
+        <w:t>Zu Beginn der ersten Projektphase führte ich detaillierte Analysegespräche mit meinem Vorgesetzten sowie den zuständigen Support-Mitarbeitern durch. Die Ergebnisse dieser Gespräche dokumentierte ich in einer Stakeholder-Analyse. Diese Analyse befindet sich vollständig im Anhang und umfasst die strategischen Geschäftsziele sowie die spezifischen Benutzeranforderungen.</w:t>
+      </w:r>
+    </w:p>
+    <w:p>
+      <w:pPr>
+        <w:rPr>
+          <w:sz w:val="20"/>
+          <w:szCs w:val="20"/>
+        </w:rPr>
+      </w:pPr>
+      <w:r>
+        <w:rPr>
+          <w:sz w:val="20"/>
+          <w:szCs w:val="20"/>
+        </w:rPr>
+        <w:t>Ich identifizierte den vollständigen Ersatz der bestehenden Legacy-Anwendung als das zentrale Projektziel. Die neue Lösung soll den identischen Funktionsumfang der Altanwendung abbilden. Die Notwendigkeit zum Ersatz ergibt sich aus der Tatsache, dass die aktuelle Anwendung lediglich im kompilierten Zustand ohne Quellcode vorliegt. Im Gespräch erkannte ich die Sorge, dass bei auftretenden Softwareproblemen keine Wartung möglich ist. Daher definierte ich neben der Kontinuität des Arbeitsablaufs die Zukunftsfähigkeit als wesentliche Motivation für das Vorhaben. Das Unternehmen benötigt eine Anwendung, welche langfristig wartbar und weiterentwickelbar bleibt.</w:t>
+      </w:r>
+    </w:p>
+    <w:p>
+      <w:pPr>
+        <w:rPr>
+          <w:sz w:val="20"/>
+          <w:szCs w:val="20"/>
+        </w:rPr>
+      </w:pPr>
+      <w:r>
+        <w:rPr>
+          <w:sz w:val="20"/>
+          <w:szCs w:val="20"/>
+        </w:rPr>
+        <w:t xml:space="preserve">Zusätzlich zur fehlenden Wartbarkeit identifizierte ich das Bedürfnis nach einer Modernisierung der Geschäftsprozesse. In den Fachgesprächen thematisierten wir eine zukünftige Cloud-Anbindung. Diese würde eine zentrale Überwachung der DMS-Systeme ermöglichen. Das Vorliegen der Anwendung ausschließlich als kompilierte Datei verhindert jedoch jegliche Verbesserungsideen. Ich ordnete das Bedürfnis nach Weiterentwicklung dem Punkt der Zukunftsfähigkeit zu. Das wichtigste Hauptziel bleibt der Ersatz des vollen Funktionsumfangs der Legacy-Anwendung ohne initiale Erweiterung. </w:t>
+      </w:r>
+    </w:p>
+    <w:p>
+      <w:pPr>
+        <w:rPr>
+          <w:sz w:val="20"/>
+          <w:szCs w:val="20"/>
+        </w:rPr>
+      </w:pPr>
+      <w:r>
+        <w:rPr>
+          <w:sz w:val="20"/>
+          <w:szCs w:val="20"/>
+        </w:rPr>
+        <w:t>Mein Vorgesetzter wünschte jedoch eine wesentliche Verbesserung bereits in der aktuellen Projektiteration. Und zwar solle eine Konfiguration über eine grafische Benutzeroberfläche möglich sein. Bisher erfolgt die Konfiguration ausschließlich über das manuelle Bearbeiten einer Datei. Dabei müssen die Benutzer eine spezifische Syntax, Semantik und Zeichensetzung beachten. Aus diesem Grund bevorzugen die Systemadministratoren eine intuitive Konfiguration per Mausklick. Damit senke ich die Nutzungshürden für alle Benutzergruppen. In meiner Stakeholder-Analyse bezeichne ich diesen Bedarf als Demokratisierung der Anwendung.</w:t>
+      </w:r>
+    </w:p>
+    <w:p>
+      <w:pPr>
+        <w:rPr>
+          <w:sz w:val="20"/>
+          <w:szCs w:val="20"/>
+        </w:rPr>
+      </w:pPr>
+      <w:r>
+        <w:rPr>
+          <w:sz w:val="20"/>
+          <w:szCs w:val="20"/>
+        </w:rPr>
+        <w:t>Dem entgegengesetzt äußerten die Entwickler den Wunsch nach Beibehaltung der dateibasierten Konfiguration. Da sie mit dem Dateiformat vertraut sind, schätzen sie das schnelle Deployment auf neuen Systemen durch einfaches Kopieren der Konfigurationsdateien. Diese unterschiedlichen Stakeholder-Wünsche stellte ich im nachfolgenden Use-Case-Diagramm dar.</w:t>
+      </w:r>
+    </w:p>
+    <w:p>
+      <w:pPr>
+        <w:rPr>
+          <w:sz w:val="20"/>
+          <w:szCs w:val="20"/>
+        </w:rPr>
+      </w:pPr>
+      <w:r>
+        <w:rPr>
+          <w:sz w:val="20"/>
+          <w:szCs w:val="20"/>
+        </w:rPr>
+        <w:lastRenderedPageBreak/>
+        <w:drawing>
+          <wp:inline distT="0" distB="0" distL="0" distR="0" wp14:anchorId="1E06F6A8" wp14:editId="2825F6C8">
+            <wp:extent cx="4572000" cy="3619500"/>
+            <wp:effectExtent l="0" t="0" r="0" b="0"/>
+            <wp:docPr id="1355862583" name="Grafik 3"/>
+            <wp:cNvGraphicFramePr>
+              <a:graphicFrameLocks xmlns:a="http://schemas.openxmlformats.org/drawingml/2006/main" noChangeAspect="1"/>
+            </wp:cNvGraphicFramePr>
+            <a:graphic xmlns:a="http://schemas.openxmlformats.org/drawingml/2006/main">
+              <a:graphicData uri="http://schemas.openxmlformats.org/drawingml/2006/picture">
+                <pic:pic xmlns:pic="http://schemas.openxmlformats.org/drawingml/2006/picture">
+                  <pic:nvPicPr>
+                    <pic:cNvPr id="0" name="Picture 6"/>
+                    <pic:cNvPicPr>
+                      <a:picLocks noChangeAspect="1" noChangeArrowheads="1"/>
+                    </pic:cNvPicPr>
+                  </pic:nvPicPr>
+                  <pic:blipFill>
+                    <a:blip r:embed="rId9">
+                      <a:extLst>
+                        <a:ext uri="{28A0092B-C50C-407E-A947-70E740481C1C}">
+                          <a14:useLocalDpi xmlns:a14="http://schemas.microsoft.com/office/drawing/2010/main" val="0"/>
+                        </a:ext>
+                      </a:extLst>
+                    </a:blip>
+                    <a:srcRect/>
+                    <a:stretch>
+                      <a:fillRect/>
+                    </a:stretch>
+                  </pic:blipFill>
+                  <pic:spPr bwMode="auto">
+                    <a:xfrm>
+                      <a:off x="0" y="0"/>
+                      <a:ext cx="4572000" cy="3619500"/>
+                    </a:xfrm>
+                    <a:prstGeom prst="rect">
+                      <a:avLst/>
+                    </a:prstGeom>
+                    <a:noFill/>
+                    <a:ln>
+                      <a:noFill/>
+                    </a:ln>
+                  </pic:spPr>
+                </pic:pic>
+              </a:graphicData>
+            </a:graphic>
+          </wp:inline>
+        </w:drawing>
+      </w:r>
+    </w:p>
+    <w:p>
+      <w:pPr>
+        <w:rPr>
+          <w:sz w:val="20"/>
+          <w:szCs w:val="20"/>
+        </w:rPr>
+      </w:pPr>
+      <w:r>
+        <w:rPr>
+          <w:sz w:val="20"/>
+          <w:szCs w:val="20"/>
+        </w:rPr>
+        <w:t> </w:t>
+      </w:r>
+    </w:p>
+    <w:p>
+      <w:pPr>
+        <w:rPr>
+          <w:sz w:val="20"/>
+          <w:szCs w:val="20"/>
+        </w:rPr>
+      </w:pPr>
+      <w:r>
+        <w:rPr>
+          <w:sz w:val="20"/>
+          <w:szCs w:val="20"/>
+        </w:rPr>
+        <w:t xml:space="preserve">Bei der Darstellung handelt es sich um eine vereinfachte Repräsentation. </w:t>
+      </w:r>
+      <w:proofErr w:type="gramStart"/>
+      <w:r>
+        <w:rPr>
+          <w:sz w:val="20"/>
+          <w:szCs w:val="20"/>
+        </w:rPr>
+        <w:t>Das detailliertes Diagramm</w:t>
+      </w:r>
+      <w:proofErr w:type="gramEnd"/>
+      <w:r>
+        <w:rPr>
+          <w:sz w:val="20"/>
+          <w:szCs w:val="20"/>
+        </w:rPr>
+        <w:t>, welches im Rahmen der Gespräche, entstand befindet sich im Anhang dieser Dokumentation. Weitere Nutzergespräche ergaben zusätzliche Verbesserungswünsche. Ich plane daher die Implementierung eines detaillierten Logging-Systems ein. Die Legacy-Anwendung besitzt kein Logging, was derzeit zu einem hohen Maß an Frustration bei der Wartung führt. Basierend auf den ermittelten Benutzerwünschen, Motivationen und Anforderungen erstellte ich die Stakeholder-Analyse im Anhang.</w:t>
+      </w:r>
+    </w:p>
+    <w:p>
+      <w:pPr>
+        <w:pStyle w:val="berschrift2"/>
+      </w:pPr>
+      <w:r>
+        <w:t>Phase 2: Systemanforderungen</w:t>
+      </w:r>
+    </w:p>
+    <w:p>
+      <w:pPr>
+        <w:rPr>
+          <w:sz w:val="20"/>
+          <w:szCs w:val="20"/>
+        </w:rPr>
+      </w:pPr>
+      <w:r>
+        <w:rPr>
+          <w:sz w:val="20"/>
+          <w:szCs w:val="20"/>
+        </w:rPr>
+        <w:t>In der zweiten Phase übersetzte ich die ermittelten Anwendungsfälle in konkrete technische Systemanforderungen. Um die Konsistenz der Ableitung sicherzustellen, erstellte ich eine Traceability-Tabelle. Diese dient als objektiver Nachweis, dass jede technische Anforderung direkt aus einem Kundenbedürfnis hervorgeht. Die vollständige Tabelle ist Bestandteil der Anforderungsanalyse im Anhang. Ein Großteil der technischen Anforderungen war durch die Vorgabe, die Legacy-Anwendung funktional zu ersetzen, bereits fest definiert. Die Kernfunktionalität umfasst die kontinuierliche Überwachung von Diensten sowie deren automatisierten Neustart im Fehlerfall. In diesen Fällen war die Übertragung von Kunden- zu Systemanforderungen unmittelbar gegeben.</w:t>
+      </w:r>
+    </w:p>
+    <w:p>
+      <w:pPr>
+        <w:rPr>
+          <w:sz w:val="20"/>
+          <w:szCs w:val="20"/>
+        </w:rPr>
+      </w:pPr>
+      <w:r>
+        <w:rPr>
+          <w:sz w:val="20"/>
+          <w:szCs w:val="20"/>
+        </w:rPr>
+        <w:t xml:space="preserve">Andere Kundenbedürfnisse erforderten jedoch eine Konkretisierung, um als technische Anforderung gelten zu können. Den allgemeinen Wunsch nach einem detaillierten Logging formulierte ich in eine konkrete Anforderung nach rotierenden Logdateien, der Verwendung klarer Log-Level sowie der Protokollierung nahezu jedes einzelnen Prozessschrittes um. </w:t>
+      </w:r>
+    </w:p>
+    <w:p>
+      <w:pPr>
+        <w:rPr>
+          <w:sz w:val="20"/>
+          <w:szCs w:val="20"/>
+        </w:rPr>
+      </w:pPr>
+      <w:r>
+        <w:rPr>
+          <w:sz w:val="20"/>
+          <w:szCs w:val="20"/>
+        </w:rPr>
+        <w:t xml:space="preserve">Weiterhin konkretisierte ich den Kundenwunsch nach einer zukunftsfähigen Lösung als Qualitätsmerkmal der Wartbarkeit und Modularität. Diese Anforderungen definierte ich gemäß dem Qualitätsmerkmalen der ISO 25010. Basierend darauf definierte ich, die Code-Qualität durch Prinzipien des Clean Code, wie das Liskov-Substitutionsprinzip oder der Separation of </w:t>
+      </w:r>
+      <w:proofErr w:type="gramStart"/>
+      <w:r>
+        <w:rPr>
+          <w:sz w:val="20"/>
+          <w:szCs w:val="20"/>
+        </w:rPr>
+        <w:t>Concerns ,</w:t>
+      </w:r>
+      <w:proofErr w:type="gramEnd"/>
+      <w:r>
+        <w:rPr>
+          <w:sz w:val="20"/>
+          <w:szCs w:val="20"/>
+        </w:rPr>
+        <w:t xml:space="preserve"> sicherzustellen. Diese Qualitäten garantieren, dass die Software für zukünftige Entwickler leicht lesbar bleibt und Anpassungen keine unvorhersehbaren Seiteneffekte in anderen Programmteilen verursachen.</w:t>
+      </w:r>
+    </w:p>
+    <w:p>
+      <w:pPr>
+        <w:rPr>
+          <w:sz w:val="20"/>
+          <w:szCs w:val="20"/>
+        </w:rPr>
+      </w:pPr>
+      <w:r>
+        <w:rPr>
+          <w:sz w:val="20"/>
+          <w:szCs w:val="20"/>
+        </w:rPr>
+        <w:lastRenderedPageBreak/>
+        <w:t xml:space="preserve">Abschließend priorisierte ich die Anforderungen gemäß der MoSCoW-Methode unter Berücksichtigung der Kundenaussagen. Alle Funktionen der Legacy-Anwendung klassifizierte ich als verbindliche Must-have-Anforderungen. Die Verwendung der Programmiersprache C# ordnete ich als Should-have ein. Die Entwickler des Kunden empfahlen diese Sprache aufgrund ihrer Expertise </w:t>
+      </w:r>
+      <w:proofErr w:type="gramStart"/>
+      <w:r>
+        <w:rPr>
+          <w:sz w:val="20"/>
+          <w:szCs w:val="20"/>
+        </w:rPr>
+        <w:t>darin</w:t>
+      </w:r>
+      <w:proofErr w:type="gramEnd"/>
+      <w:r>
+        <w:rPr>
+          <w:sz w:val="20"/>
+          <w:szCs w:val="20"/>
+        </w:rPr>
+        <w:t xml:space="preserve"> was </w:t>
+      </w:r>
+      <w:proofErr w:type="gramStart"/>
+      <w:r>
+        <w:rPr>
+          <w:sz w:val="20"/>
+          <w:szCs w:val="20"/>
+        </w:rPr>
+        <w:t>die späteren Wartung</w:t>
+      </w:r>
+      <w:proofErr w:type="gramEnd"/>
+      <w:r>
+        <w:rPr>
+          <w:sz w:val="20"/>
+          <w:szCs w:val="20"/>
+        </w:rPr>
+        <w:t xml:space="preserve"> erleichtern würde. Dennoch blieb die Wahl anderer Technologien bei entsprechender Begründung freigestellt. Auch die Konfiguration über die grafische Benutzeroberfläche definierte ich als Should-have, da die funktionale Zuverlässigkeit des Hintergrunddienstes Vorrang besitzt. Die Prüfung technischer Abhängigkeiten, welche ich konkret als Portprüfung spezifizierte, stufte ich als Could-have ein. Da die Legacy-Anwendung diese Funktion nicht besaß, bewertete der Kunde sie als optional. Ebenso ordnete ich eine mögliche E-Mail-Benachrichtigung den Could-have-Kriterien zu. Den Ausblick auf eine Cloud-Anbindung oder eine Integration über einen Server-Eye-Connector definierte ich als Won’t-have. Diese Erweiterungen sind nicht Bestandteil der aktuellen Projektiteration, wurden jedoch bei der Architekturplanung für eine zukünftige Implementierung berücksichtigt.</w:t>
+      </w:r>
+    </w:p>
+    <w:p/>
+    <w:p>
+      <w:pPr>
+        <w:pStyle w:val="berschrift2"/>
+      </w:pPr>
+      <w:r>
+        <w:t>Phase 3: System-Architektur</w:t>
+      </w:r>
+    </w:p>
+    <w:p>
+      <w:pPr>
+        <w:rPr>
+          <w:sz w:val="20"/>
+          <w:szCs w:val="20"/>
+        </w:rPr>
+      </w:pPr>
+      <w:r>
+        <w:rPr>
+          <w:sz w:val="20"/>
+          <w:szCs w:val="20"/>
+        </w:rPr>
+        <w:t>Aus den funktionalen Anforderungen leitete ich ab, welche Komponenten zur Zielerreichung notwendig sind. Da die regelmäßige Überwachung von Diensten einen Dauerbetrieb erfordert, konzipierte ich die Anwendung als Hintergrunddienst. Der Kunde gab zudem vor, dass die Konfiguration sowohl über eine grafische Benutzeroberfläche als auch direkt über eine Datei möglich sein soll. Daraus identifizierte ich die GUI und die Konfigurationsdatei als zwei weitere notwendige Komponenten. Um den Dienst nicht über zwei separate Schnittstellen konfigurierbar machen zu müssen, entschied ich mich für ein „Headless Design“. In diesem Architekturmodell fungiert die Konfigurationsdatei als zentrale Schnittstelle und einzige Datenquelle für den Hintergrunddienst. Die GUI dient ausschließlich der Bearbeitung dieser Datei, während der Überwachungsdienst seine Anweisungen stets direkt aus der Datei bezieht. Dieser Ansatz stellt sicher, dass die Kernfunktionalität des Dienstes vollständig unabhängig von der grafischen Oberfläche bleibt. Die Kommunikation und die Struktur dieser drei Komponenten stellte ich in einem UML-Komponentendiagramm dar.</w:t>
+      </w:r>
+    </w:p>
+    <w:p>
+      <w:pPr>
+        <w:rPr>
+          <w:sz w:val="20"/>
+          <w:szCs w:val="20"/>
+        </w:rPr>
+      </w:pPr>
+      <w:r>
+        <w:rPr>
+          <w:sz w:val="20"/>
+          <w:szCs w:val="20"/>
+        </w:rPr>
+        <w:lastRenderedPageBreak/>
+        <w:drawing>
+          <wp:inline distT="0" distB="0" distL="0" distR="0" wp14:anchorId="2EA65E0F" wp14:editId="2076CAE8">
+            <wp:extent cx="4572000" cy="4709160"/>
+            <wp:effectExtent l="0" t="0" r="0" b="0"/>
+            <wp:docPr id="724400719" name="Grafik 5"/>
+            <wp:cNvGraphicFramePr>
+              <a:graphicFrameLocks xmlns:a="http://schemas.openxmlformats.org/drawingml/2006/main" noChangeAspect="1"/>
+            </wp:cNvGraphicFramePr>
+            <a:graphic xmlns:a="http://schemas.openxmlformats.org/drawingml/2006/main">
+              <a:graphicData uri="http://schemas.openxmlformats.org/drawingml/2006/picture">
+                <pic:pic xmlns:pic="http://schemas.openxmlformats.org/drawingml/2006/picture">
+                  <pic:nvPicPr>
+                    <pic:cNvPr id="0" name="Picture 13"/>
+                    <pic:cNvPicPr>
+                      <a:picLocks noChangeAspect="1" noChangeArrowheads="1"/>
+                    </pic:cNvPicPr>
+                  </pic:nvPicPr>
+                  <pic:blipFill>
+                    <a:blip r:embed="rId10">
+                      <a:extLst>
+                        <a:ext uri="{28A0092B-C50C-407E-A947-70E740481C1C}">
+                          <a14:useLocalDpi xmlns:a14="http://schemas.microsoft.com/office/drawing/2010/main" val="0"/>
+                        </a:ext>
+                      </a:extLst>
+                    </a:blip>
+                    <a:srcRect/>
+                    <a:stretch>
+                      <a:fillRect/>
+                    </a:stretch>
+                  </pic:blipFill>
+                  <pic:spPr bwMode="auto">
+                    <a:xfrm>
+                      <a:off x="0" y="0"/>
+                      <a:ext cx="4572000" cy="4709160"/>
+                    </a:xfrm>
+                    <a:prstGeom prst="rect">
+                      <a:avLst/>
+                    </a:prstGeom>
+                    <a:noFill/>
+                    <a:ln>
+                      <a:noFill/>
+                    </a:ln>
+                  </pic:spPr>
+                </pic:pic>
+              </a:graphicData>
+            </a:graphic>
+          </wp:inline>
+        </w:drawing>
+      </w:r>
+    </w:p>
+    <w:p>
+      <w:pPr>
+        <w:rPr>
+          <w:sz w:val="20"/>
+          <w:szCs w:val="20"/>
+        </w:rPr>
+      </w:pPr>
+      <w:r>
+        <w:rPr>
+          <w:sz w:val="20"/>
+          <w:szCs w:val="20"/>
+        </w:rPr>
+        <w:t xml:space="preserve">Ein Kernaspekt der dritten Phase ist die Definition eines Vertrages zwischen den Komponenten in Form einer Spezifikation der Datenschnittstelle. Meine Aufgabe bestand darin, ein geeignetes Datenmodell zu entwerfen, den Dateityp zu wählen und die erforderlichen Informationen inklusive ihrer Datentypen festzulegen. Bei der Auswahl des Formats analysierte ich zunächst verschiedene moderne Standards. Ursprünglich fiel meine Wahl auf YAML, da dieses Format für die menschliche Lesbarkeit optimiert ist und eine minimale Syntax ohne komplexe Klammersetzung benötigt. In der Abstimmung mit meinem Ausbilder wurde dieser Vorschlag jedoch abgelehnt. Wir entschieden uns stattdessen für JSON, da dieses Format im Unternehmen bereits standardmäßig eingesetzt wird und alle Entwickler damit vertraut sind. Für die Schnittstellenbeschreibung definierte ich alle relevanten Informationen, die das System abbilden muss. Dazu gehören die </w:t>
+      </w:r>
+      <w:proofErr w:type="gramStart"/>
+      <w:r>
+        <w:rPr>
+          <w:sz w:val="20"/>
+          <w:szCs w:val="20"/>
+        </w:rPr>
+        <w:t>zu überwachenden Dienste</w:t>
+      </w:r>
+      <w:proofErr w:type="gramEnd"/>
+      <w:r>
+        <w:rPr>
+          <w:sz w:val="20"/>
+          <w:szCs w:val="20"/>
+        </w:rPr>
+        <w:t xml:space="preserve"> inklusive ihrer Startverzögerungen, Log-Tests und Port-Prüfungen sowie deren Ausführungsreihenfolge. Zusätzlich integrierte ich Konfigurationen für den Mail-Server und globale Einstellungen wie das Log-Level. Ich wählte für diese Informationen passende Datentypen und bildete sie in JSON als strukturierte Objekte ab. Das resultierende Datenmodell dokumentierte ich in Form einer Beispiel-JSON-Datei sowie in einem detaillierten Klassendiagramm im Anhang.</w:t>
       </w:r>
     </w:p>
     <w:p/>
     <w:sectPr>
+      <w:footerReference w:type="default" r:id="rId11"/>
       <w:pgSz w:w="11906" w:h="16838"/>
       <w:pgMar w:top="1418" w:right="1418" w:bottom="1134" w:left="1418" w:header="680" w:footer="0" w:gutter="0"/>
       <w:cols w:space="708"/>
@@ -3834,6 +3771,306 @@
     </w:sectPr>
   </w:body>
 </w:document>
+</file>
+
+<file path=word/endnotes.xml><?xml version="1.0" encoding="utf-8"?>
+<w:endnotes xmlns:wpc="http://schemas.microsoft.com/office/word/2010/wordprocessingCanvas" xmlns:cx="http://schemas.microsoft.com/office/drawing/2014/chartex" xmlns:cx1="http://schemas.microsoft.com/office/drawing/2015/9/8/chartex" xmlns:cx2="http://schemas.microsoft.com/office/drawing/2015/10/21/chartex" xmlns:cx3="http://schemas.microsoft.com/office/drawing/2016/5/9/chartex" xmlns:cx4="http://schemas.microsoft.com/office/drawing/2016/5/10/chartex" xmlns:cx5="http://schemas.microsoft.com/office/drawing/2016/5/11/chartex" xmlns:cx6="http://schemas.microsoft.com/office/drawing/2016/5/12/chartex" xmlns:cx7="http://schemas.microsoft.com/office/drawing/2016/5/13/chartex" xmlns:cx8="http://schemas.microsoft.com/office/drawing/2016/5/14/chartex" xmlns:mc="http://schemas.openxmlformats.org/markup-compatibility/2006" xmlns:aink="http://schemas.microsoft.com/office/drawing/2016/ink" xmlns:am3d="http://schemas.microsoft.com/office/drawing/2017/model3d" xmlns:o="urn:schemas-microsoft-com:office:office" xmlns:oel="http://schemas.microsoft.com/office/2019/extlst" xmlns:r="http://schemas.openxmlformats.org/officeDocument/2006/relationships" xmlns:m="http://schemas.openxmlformats.org/officeDocument/2006/math" xmlns:v="urn:schemas-microsoft-com:vml" xmlns:wp14="http://schemas.microsoft.com/office/word/2010/wordprocessingDrawing" xmlns:wp="http://schemas.openxmlformats.org/drawingml/2006/wordprocessingDrawing" xmlns:w10="urn:schemas-microsoft-com:office:word" xmlns:w="http://schemas.openxmlformats.org/wordprocessingml/2006/main" xmlns:w14="http://schemas.microsoft.com/office/word/2010/wordml" xmlns:w15="http://schemas.microsoft.com/office/word/2012/wordml" xmlns:w16cex="http://schemas.microsoft.com/office/word/2018/wordml/cex" xmlns:w16cid="http://schemas.microsoft.com/office/word/2016/wordml/cid" xmlns:w16="http://schemas.microsoft.com/office/word/2018/wordml" xmlns:w16du="http://schemas.microsoft.com/office/word/2023/wordml/word16du" xmlns:w16sdtdh="http://schemas.microsoft.com/office/word/2020/wordml/sdtdatahash" xmlns:w16sdtfl="http://schemas.microsoft.com/office/word/2024/wordml/sdtformatlock" xmlns:w16se="http://schemas.microsoft.com/office/word/2015/wordml/symex" xmlns:wpg="http://schemas.microsoft.com/office/word/2010/wordprocessingGroup" xmlns:wpi="http://schemas.microsoft.com/office/word/2010/wordprocessingInk" xmlns:wne="http://schemas.microsoft.com/office/word/2006/wordml" xmlns:wps="http://schemas.microsoft.com/office/word/2010/wordprocessingShape" mc:Ignorable="w14 w15 w16se w16cid w16 w16cex w16sdtdh w16sdtfl w16du wp14">
+  <w:endnote w:type="separator" w:id="-1">
+    <w:p>
+      <w:pPr>
+        <w:spacing w:after="0" w:line="240" w:lineRule="auto"/>
+      </w:pPr>
+      <w:r>
+        <w:separator/>
+      </w:r>
+    </w:p>
+  </w:endnote>
+  <w:endnote w:type="continuationSeparator" w:id="0">
+    <w:p>
+      <w:pPr>
+        <w:spacing w:after="0" w:line="240" w:lineRule="auto"/>
+      </w:pPr>
+      <w:r>
+        <w:continuationSeparator/>
+      </w:r>
+    </w:p>
+  </w:endnote>
+</w:endnotes>
+</file>
+
+<file path=word/footer1.xml><?xml version="1.0" encoding="utf-8"?>
+<w:ftr xmlns:wpc="http://schemas.microsoft.com/office/word/2010/wordprocessingCanvas" xmlns:cx="http://schemas.microsoft.com/office/drawing/2014/chartex" xmlns:cx1="http://schemas.microsoft.com/office/drawing/2015/9/8/chartex" xmlns:cx2="http://schemas.microsoft.com/office/drawing/2015/10/21/chartex" xmlns:cx3="http://schemas.microsoft.com/office/drawing/2016/5/9/chartex" xmlns:cx4="http://schemas.microsoft.com/office/drawing/2016/5/10/chartex" xmlns:cx5="http://schemas.microsoft.com/office/drawing/2016/5/11/chartex" xmlns:cx6="http://schemas.microsoft.com/office/drawing/2016/5/12/chartex" xmlns:cx7="http://schemas.microsoft.com/office/drawing/2016/5/13/chartex" xmlns:cx8="http://schemas.microsoft.com/office/drawing/2016/5/14/chartex" xmlns:mc="http://schemas.openxmlformats.org/markup-compatibility/2006" xmlns:aink="http://schemas.microsoft.com/office/drawing/2016/ink" xmlns:am3d="http://schemas.microsoft.com/office/drawing/2017/model3d" xmlns:o="urn:schemas-microsoft-com:office:office" xmlns:oel="http://schemas.microsoft.com/office/2019/extlst" xmlns:r="http://schemas.openxmlformats.org/officeDocument/2006/relationships" xmlns:m="http://schemas.openxmlformats.org/officeDocument/2006/math" xmlns:v="urn:schemas-microsoft-com:vml" xmlns:wp14="http://schemas.microsoft.com/office/word/2010/wordprocessingDrawing" xmlns:wp="http://schemas.openxmlformats.org/drawingml/2006/wordprocessingDrawing" xmlns:w10="urn:schemas-microsoft-com:office:word" xmlns:w="http://schemas.openxmlformats.org/wordprocessingml/2006/main" xmlns:w14="http://schemas.microsoft.com/office/word/2010/wordml" xmlns:w15="http://schemas.microsoft.com/office/word/2012/wordml" xmlns:w16cex="http://schemas.microsoft.com/office/word/2018/wordml/cex" xmlns:w16cid="http://schemas.microsoft.com/office/word/2016/wordml/cid" xmlns:w16="http://schemas.microsoft.com/office/word/2018/wordml" xmlns:w16du="http://schemas.microsoft.com/office/word/2023/wordml/word16du" xmlns:w16sdtdh="http://schemas.microsoft.com/office/word/2020/wordml/sdtdatahash" xmlns:w16sdtfl="http://schemas.microsoft.com/office/word/2024/wordml/sdtformatlock" xmlns:w16se="http://schemas.microsoft.com/office/word/2015/wordml/symex" xmlns:wpg="http://schemas.microsoft.com/office/word/2010/wordprocessingGroup" xmlns:wpi="http://schemas.microsoft.com/office/word/2010/wordprocessingInk" xmlns:wne="http://schemas.microsoft.com/office/word/2006/wordml" xmlns:wps="http://schemas.microsoft.com/office/word/2010/wordprocessingShape" mc:Ignorable="w14 w15 w16se w16cid w16 w16cex w16sdtdh w16sdtfl w16du wp14">
+  <w:sdt>
+    <w:sdtPr>
+      <w:id w:val="662134987"/>
+      <w:docPartObj>
+        <w:docPartGallery w:val="Page Numbers (Bottom of Page)"/>
+        <w:docPartUnique/>
+      </w:docPartObj>
+    </w:sdtPr>
+    <w:sdtContent>
+      <w:p>
+        <w:pPr>
+          <w:pStyle w:val="Fuzeile"/>
+          <w:jc w:val="right"/>
+        </w:pPr>
+        <w:r>
+          <w:rPr>
+            <w:rFonts w:asciiTheme="majorHAnsi" w:eastAsiaTheme="majorEastAsia" w:hAnsiTheme="majorHAnsi" w:cstheme="majorBidi"/>
+            <w:noProof/>
+            <w:sz w:val="48"/>
+            <w:szCs w:val="48"/>
+          </w:rPr>
+          <mc:AlternateContent>
+            <mc:Choice Requires="wps">
+              <w:drawing>
+                <wp:anchor distT="0" distB="0" distL="114300" distR="114300" simplePos="0" relativeHeight="251659264" behindDoc="0" locked="0" layoutInCell="1" allowOverlap="1" wp14:anchorId="68BBA189" wp14:editId="39FA41B4">
+                  <wp:simplePos x="0" y="0"/>
+                  <wp:positionH relativeFrom="rightMargin">
+                    <wp:align>center</wp:align>
+                  </wp:positionH>
+                  <wp:positionV relativeFrom="bottomMargin">
+                    <wp:align>top</wp:align>
+                  </wp:positionV>
+                  <wp:extent cx="762000" cy="895350"/>
+                  <wp:effectExtent l="0" t="0" r="0" b="0"/>
+                  <wp:wrapNone/>
+                  <wp:docPr id="205061622" name="Rechteck 2"/>
+                  <wp:cNvGraphicFramePr>
+                    <a:graphicFrameLocks xmlns:a="http://schemas.openxmlformats.org/drawingml/2006/main"/>
+                  </wp:cNvGraphicFramePr>
+                  <a:graphic xmlns:a="http://schemas.openxmlformats.org/drawingml/2006/main">
+                    <a:graphicData uri="http://schemas.microsoft.com/office/word/2010/wordprocessingShape">
+                      <wps:wsp>
+                        <wps:cNvSpPr>
+                          <a:spLocks noChangeArrowheads="1"/>
+                        </wps:cNvSpPr>
+                        <wps:spPr bwMode="auto">
+                          <a:xfrm>
+                            <a:off x="0" y="0"/>
+                            <a:ext cx="762000" cy="895350"/>
+                          </a:xfrm>
+                          <a:prstGeom prst="rect">
+                            <a:avLst/>
+                          </a:prstGeom>
+                          <a:solidFill>
+                            <a:srgbClr val="FFFFFF"/>
+                          </a:solidFill>
+                          <a:ln>
+                            <a:noFill/>
+                          </a:ln>
+                          <a:extLst>
+                            <a:ext uri="{91240B29-F687-4F45-9708-019B960494DF}">
+                              <a14:hiddenLine xmlns:a14="http://schemas.microsoft.com/office/drawing/2010/main" w="9525">
+                                <a:solidFill>
+                                  <a:srgbClr val="000000"/>
+                                </a:solidFill>
+                                <a:miter lim="800000"/>
+                                <a:headEnd/>
+                                <a:tailEnd/>
+                              </a14:hiddenLine>
+                            </a:ext>
+                          </a:extLst>
+                        </wps:spPr>
+                        <wps:txbx>
+                          <w:txbxContent>
+                            <w:sdt>
+                              <w:sdtPr>
+                                <w:rPr>
+                                  <w:rFonts w:asciiTheme="majorHAnsi" w:eastAsiaTheme="majorEastAsia" w:hAnsiTheme="majorHAnsi" w:cstheme="majorBidi"/>
+                                  <w:sz w:val="48"/>
+                                  <w:szCs w:val="48"/>
+                                </w:rPr>
+                                <w:id w:val="1709992740"/>
+                              </w:sdtPr>
+                              <w:sdtContent>
+                                <w:sdt>
+                                  <w:sdtPr>
+                                    <w:rPr>
+                                      <w:rFonts w:asciiTheme="majorHAnsi" w:eastAsiaTheme="majorEastAsia" w:hAnsiTheme="majorHAnsi" w:cstheme="majorBidi"/>
+                                      <w:sz w:val="48"/>
+                                      <w:szCs w:val="48"/>
+                                    </w:rPr>
+                                    <w:id w:val="-1904517296"/>
+                                  </w:sdtPr>
+                                  <w:sdtContent>
+                                    <w:p>
+                                      <w:pPr>
+                                        <w:jc w:val="center"/>
+                                        <w:rPr>
+                                          <w:rFonts w:asciiTheme="majorHAnsi" w:eastAsiaTheme="majorEastAsia" w:hAnsiTheme="majorHAnsi" w:cstheme="majorBidi"/>
+                                          <w:sz w:val="48"/>
+                                          <w:szCs w:val="48"/>
+                                        </w:rPr>
+                                      </w:pPr>
+                                      <w:r>
+                                        <w:rPr>
+                                          <w:rFonts w:eastAsiaTheme="minorEastAsia" w:cs="Times New Roman"/>
+                                          <w:sz w:val="22"/>
+                                          <w:szCs w:val="22"/>
+                                        </w:rPr>
+                                        <w:fldChar w:fldCharType="begin"/>
+                                      </w:r>
+                                      <w:r>
+                                        <w:instrText>PAGE   \* MERGEFORMAT</w:instrText>
+                                      </w:r>
+                                      <w:r>
+                                        <w:rPr>
+                                          <w:rFonts w:eastAsiaTheme="minorEastAsia" w:cs="Times New Roman"/>
+                                          <w:sz w:val="22"/>
+                                          <w:szCs w:val="22"/>
+                                        </w:rPr>
+                                        <w:fldChar w:fldCharType="separate"/>
+                                      </w:r>
+                                      <w:r>
+                                        <w:rPr>
+                                          <w:rFonts w:asciiTheme="majorHAnsi" w:eastAsiaTheme="majorEastAsia" w:hAnsiTheme="majorHAnsi" w:cstheme="majorBidi"/>
+                                          <w:sz w:val="48"/>
+                                          <w:szCs w:val="48"/>
+                                        </w:rPr>
+                                        <w:t>2</w:t>
+                                      </w:r>
+                                      <w:r>
+                                        <w:rPr>
+                                          <w:rFonts w:asciiTheme="majorHAnsi" w:eastAsiaTheme="majorEastAsia" w:hAnsiTheme="majorHAnsi" w:cstheme="majorBidi"/>
+                                          <w:sz w:val="48"/>
+                                          <w:szCs w:val="48"/>
+                                        </w:rPr>
+                                        <w:fldChar w:fldCharType="end"/>
+                                      </w:r>
+                                    </w:p>
+                                  </w:sdtContent>
+                                </w:sdt>
+                              </w:sdtContent>
+                            </w:sdt>
+                          </w:txbxContent>
+                        </wps:txbx>
+                        <wps:bodyPr rot="0" vert="horz" wrap="square" lIns="91440" tIns="45720" rIns="91440" bIns="45720" anchor="t" anchorCtr="0" upright="1">
+                          <a:noAutofit/>
+                        </wps:bodyPr>
+                      </wps:wsp>
+                    </a:graphicData>
+                  </a:graphic>
+                  <wp14:sizeRelH relativeFrom="page">
+                    <wp14:pctWidth>0</wp14:pctWidth>
+                  </wp14:sizeRelH>
+                  <wp14:sizeRelV relativeFrom="page">
+                    <wp14:pctHeight>0</wp14:pctHeight>
+                  </wp14:sizeRelV>
+                </wp:anchor>
+              </w:drawing>
+            </mc:Choice>
+            <mc:Fallback>
+              <w:pict>
+                <v:rect w14:anchorId="68BBA189" id="Rechteck 2" o:spid="_x0000_s1026" style="position:absolute;left:0;text-align:left;margin-left:0;margin-top:0;width:60pt;height:70.5pt;z-index:251659264;visibility:visible;mso-wrap-style:square;mso-width-percent:0;mso-height-percent:0;mso-wrap-distance-left:9pt;mso-wrap-distance-top:0;mso-wrap-distance-right:9pt;mso-wrap-distance-bottom:0;mso-position-horizontal:center;mso-position-horizontal-relative:right-margin-area;mso-position-vertical:top;mso-position-vertical-relative:bottom-margin-area;mso-width-percent:0;mso-height-percent:0;mso-width-relative:page;mso-height-relative:page;v-text-anchor:top" o:gfxdata="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" stroked="f">
+                  <v:textbox>
+                    <w:txbxContent>
+                      <w:sdt>
+                        <w:sdtPr>
+                          <w:rPr>
+                            <w:rFonts w:asciiTheme="majorHAnsi" w:eastAsiaTheme="majorEastAsia" w:hAnsiTheme="majorHAnsi" w:cstheme="majorBidi"/>
+                            <w:sz w:val="48"/>
+                            <w:szCs w:val="48"/>
+                          </w:rPr>
+                          <w:id w:val="1709992740"/>
+                        </w:sdtPr>
+                        <w:sdtContent>
+                          <w:sdt>
+                            <w:sdtPr>
+                              <w:rPr>
+                                <w:rFonts w:asciiTheme="majorHAnsi" w:eastAsiaTheme="majorEastAsia" w:hAnsiTheme="majorHAnsi" w:cstheme="majorBidi"/>
+                                <w:sz w:val="48"/>
+                                <w:szCs w:val="48"/>
+                              </w:rPr>
+                              <w:id w:val="-1904517296"/>
+                            </w:sdtPr>
+                            <w:sdtContent>
+                              <w:p>
+                                <w:pPr>
+                                  <w:jc w:val="center"/>
+                                  <w:rPr>
+                                    <w:rFonts w:asciiTheme="majorHAnsi" w:eastAsiaTheme="majorEastAsia" w:hAnsiTheme="majorHAnsi" w:cstheme="majorBidi"/>
+                                    <w:sz w:val="48"/>
+                                    <w:szCs w:val="48"/>
+                                  </w:rPr>
+                                </w:pPr>
+                                <w:r>
+                                  <w:rPr>
+                                    <w:rFonts w:eastAsiaTheme="minorEastAsia" w:cs="Times New Roman"/>
+                                    <w:sz w:val="22"/>
+                                    <w:szCs w:val="22"/>
+                                  </w:rPr>
+                                  <w:fldChar w:fldCharType="begin"/>
+                                </w:r>
+                                <w:r>
+                                  <w:instrText>PAGE   \* MERGEFORMAT</w:instrText>
+                                </w:r>
+                                <w:r>
+                                  <w:rPr>
+                                    <w:rFonts w:eastAsiaTheme="minorEastAsia" w:cs="Times New Roman"/>
+                                    <w:sz w:val="22"/>
+                                    <w:szCs w:val="22"/>
+                                  </w:rPr>
+                                  <w:fldChar w:fldCharType="separate"/>
+                                </w:r>
+                                <w:r>
+                                  <w:rPr>
+                                    <w:rFonts w:asciiTheme="majorHAnsi" w:eastAsiaTheme="majorEastAsia" w:hAnsiTheme="majorHAnsi" w:cstheme="majorBidi"/>
+                                    <w:sz w:val="48"/>
+                                    <w:szCs w:val="48"/>
+                                  </w:rPr>
+                                  <w:t>2</w:t>
+                                </w:r>
+                                <w:r>
+                                  <w:rPr>
+                                    <w:rFonts w:asciiTheme="majorHAnsi" w:eastAsiaTheme="majorEastAsia" w:hAnsiTheme="majorHAnsi" w:cstheme="majorBidi"/>
+                                    <w:sz w:val="48"/>
+                                    <w:szCs w:val="48"/>
+                                  </w:rPr>
+                                  <w:fldChar w:fldCharType="end"/>
+                                </w:r>
+                              </w:p>
+                            </w:sdtContent>
+                          </w:sdt>
+                        </w:sdtContent>
+                      </w:sdt>
+                    </w:txbxContent>
+                  </v:textbox>
+                  <w10:wrap anchorx="margin" anchory="margin"/>
+                </v:rect>
+              </w:pict>
+            </mc:Fallback>
+          </mc:AlternateContent>
+        </w:r>
+      </w:p>
+    </w:sdtContent>
+  </w:sdt>
+</w:ftr>
+</file>
+
+<file path=word/footnotes.xml><?xml version="1.0" encoding="utf-8"?>
+<w:footnotes xmlns:wpc="http://schemas.microsoft.com/office/word/2010/wordprocessingCanvas" xmlns:cx="http://schemas.microsoft.com/office/drawing/2014/chartex" xmlns:cx1="http://schemas.microsoft.com/office/drawing/2015/9/8/chartex" xmlns:cx2="http://schemas.microsoft.com/office/drawing/2015/10/21/chartex" xmlns:cx3="http://schemas.microsoft.com/office/drawing/2016/5/9/chartex" xmlns:cx4="http://schemas.microsoft.com/office/drawing/2016/5/10/chartex" xmlns:cx5="http://schemas.microsoft.com/office/drawing/2016/5/11/chartex" xmlns:cx6="http://schemas.microsoft.com/office/drawing/2016/5/12/chartex" xmlns:cx7="http://schemas.microsoft.com/office/drawing/2016/5/13/chartex" xmlns:cx8="http://schemas.microsoft.com/office/drawing/2016/5/14/chartex" xmlns:mc="http://schemas.openxmlformats.org/markup-compatibility/2006" xmlns:aink="http://schemas.microsoft.com/office/drawing/2016/ink" xmlns:am3d="http://schemas.microsoft.com/office/drawing/2017/model3d" xmlns:o="urn:schemas-microsoft-com:office:office" xmlns:oel="http://schemas.microsoft.com/office/2019/extlst" xmlns:r="http://schemas.openxmlformats.org/officeDocument/2006/relationships" xmlns:m="http://schemas.openxmlformats.org/officeDocument/2006/math" xmlns:v="urn:schemas-microsoft-com:vml" xmlns:wp14="http://schemas.microsoft.com/office/word/2010/wordprocessingDrawing" xmlns:wp="http://schemas.openxmlformats.org/drawingml/2006/wordprocessingDrawing" xmlns:w10="urn:schemas-microsoft-com:office:word" xmlns:w="http://schemas.openxmlformats.org/wordprocessingml/2006/main" xmlns:w14="http://schemas.microsoft.com/office/word/2010/wordml" xmlns:w15="http://schemas.microsoft.com/office/word/2012/wordml" xmlns:w16cex="http://schemas.microsoft.com/office/word/2018/wordml/cex" xmlns:w16cid="http://schemas.microsoft.com/office/word/2016/wordml/cid" xmlns:w16="http://schemas.microsoft.com/office/word/2018/wordml" xmlns:w16du="http://schemas.microsoft.com/office/word/2023/wordml/word16du" xmlns:w16sdtdh="http://schemas.microsoft.com/office/word/2020/wordml/sdtdatahash" xmlns:w16sdtfl="http://schemas.microsoft.com/office/word/2024/wordml/sdtformatlock" xmlns:w16se="http://schemas.microsoft.com/office/word/2015/wordml/symex" xmlns:wpg="http://schemas.microsoft.com/office/word/2010/wordprocessingGroup" xmlns:wpi="http://schemas.microsoft.com/office/word/2010/wordprocessingInk" xmlns:wne="http://schemas.microsoft.com/office/word/2006/wordml" xmlns:wps="http://schemas.microsoft.com/office/word/2010/wordprocessingShape" mc:Ignorable="w14 w15 w16se w16cid w16 w16cex w16sdtdh w16sdtfl w16du wp14">
+  <w:footnote w:type="separator" w:id="-1">
+    <w:p>
+      <w:pPr>
+        <w:spacing w:after="0" w:line="240" w:lineRule="auto"/>
+      </w:pPr>
+      <w:r>
+        <w:separator/>
+      </w:r>
+    </w:p>
+  </w:footnote>
+  <w:footnote w:type="continuationSeparator" w:id="0">
+    <w:p>
+      <w:pPr>
+        <w:spacing w:after="0" w:line="240" w:lineRule="auto"/>
+      </w:pPr>
+      <w:r>
+        <w:continuationSeparator/>
+      </w:r>
+    </w:p>
+  </w:footnote>
+</w:footnotes>
 </file>
 
 <file path=word/styles.xml><?xml version="1.0" encoding="utf-8"?>
@@ -4829,6 +5066,50 @@
       <w:ind w:left="480"/>
     </w:pPr>
   </w:style>
+  <w:style w:type="paragraph" w:styleId="Kopfzeile">
+    <w:name w:val="header"/>
+    <w:basedOn w:val="Standard"/>
+    <w:link w:val="KopfzeileZchn"/>
+    <w:uiPriority w:val="99"/>
+    <w:unhideWhenUsed/>
+    <w:rsid w:val="00ED698E"/>
+    <w:pPr>
+      <w:tabs>
+        <w:tab w:val="center" w:pos="4536"/>
+        <w:tab w:val="right" w:pos="9072"/>
+      </w:tabs>
+      <w:spacing w:after="0" w:line="240" w:lineRule="auto"/>
+    </w:pPr>
+  </w:style>
+  <w:style w:type="character" w:customStyle="1" w:styleId="KopfzeileZchn">
+    <w:name w:val="Kopfzeile Zchn"/>
+    <w:basedOn w:val="Absatz-Standardschriftart"/>
+    <w:link w:val="Kopfzeile"/>
+    <w:uiPriority w:val="99"/>
+    <w:rsid w:val="00ED698E"/>
+  </w:style>
+  <w:style w:type="paragraph" w:styleId="Fuzeile">
+    <w:name w:val="footer"/>
+    <w:basedOn w:val="Standard"/>
+    <w:link w:val="FuzeileZchn"/>
+    <w:uiPriority w:val="99"/>
+    <w:unhideWhenUsed/>
+    <w:rsid w:val="00ED698E"/>
+    <w:pPr>
+      <w:tabs>
+        <w:tab w:val="center" w:pos="4536"/>
+        <w:tab w:val="right" w:pos="9072"/>
+      </w:tabs>
+      <w:spacing w:after="0" w:line="240" w:lineRule="auto"/>
+    </w:pPr>
+  </w:style>
+  <w:style w:type="character" w:customStyle="1" w:styleId="FuzeileZchn">
+    <w:name w:val="Fußzeile Zchn"/>
+    <w:basedOn w:val="Absatz-Standardschriftart"/>
+    <w:link w:val="Fuzeile"/>
+    <w:uiPriority w:val="99"/>
+    <w:rsid w:val="00ED698E"/>
+  </w:style>
 </w:styles>
 </file>
 

</xml_diff>

<commit_message>
fix(graphic_w-model) - replaced v2 with v3
</commit_message>
<xml_diff>
--- a/2026-04-16_Projektdokumentation.docx
+++ b/2026-04-16_Projektdokumentation.docx
@@ -1138,23 +1138,7 @@
           <w:sz w:val="20"/>
           <w:szCs w:val="20"/>
         </w:rPr>
-        <w:t xml:space="preserve">Der Kunde für dieses Projekt ist die Support-Abteilung meines eigenen Betriebes, diese ist für ihre Aufgaben in der Verwaltung, beteurun und fehlerbehebung der Dms-Systeme und Server auf einige dritt software angewiesen. Auf das genaue software-produkt was in diesem </w:t>
-      </w:r>
-      <w:proofErr w:type="gramStart"/>
-      <w:r>
-        <w:rPr>
-          <w:sz w:val="20"/>
-          <w:szCs w:val="20"/>
-        </w:rPr>
-        <w:t>fall</w:t>
-      </w:r>
-      <w:proofErr w:type="gramEnd"/>
-      <w:r>
-        <w:rPr>
-          <w:sz w:val="20"/>
-          <w:szCs w:val="20"/>
-        </w:rPr>
-        <w:t xml:space="preserve"> benötigt wird, wird unter Ist-Zustand eingegangen.</w:t>
+        <w:t>Der Kunde für dieses Projekt ist die Support-Abteilung meines eigenen Betriebes, diese ist für ihre Aufgaben in der Verwaltung, beteurun und fehlerbehebung der Dms-Systeme und Server auf einige dritt software angewiesen. Auf das genaue software-produkt was in diesem fall benötigt wird, wird unter Ist-Zustand eingegangen.</w:t>
       </w:r>
     </w:p>
     <w:p>
@@ -1781,23 +1765,7 @@
           <w:sz w:val="20"/>
           <w:szCs w:val="20"/>
         </w:rPr>
-        <w:t>Ich nutze das „Worker Service“-Template für den Hintergrunddienst. Das Template implementiert die „</w:t>
-      </w:r>
-      <w:proofErr w:type="gramStart"/>
-      <w:r>
-        <w:rPr>
-          <w:sz w:val="20"/>
-          <w:szCs w:val="20"/>
-        </w:rPr>
-        <w:t>Microsoft.Extensions.Hosting</w:t>
-      </w:r>
-      <w:proofErr w:type="gramEnd"/>
-      <w:r>
-        <w:rPr>
-          <w:sz w:val="20"/>
-          <w:szCs w:val="20"/>
-        </w:rPr>
-        <w:t>“-API. Damit ist die Anwendung potenziell auch in Linux-Umgebungen lauffähig. Dies ist eine deutliche Verbesserung gegenüber der veralteten Windows Services API der .NET-3.0 – Ära, welche lediglich auf Windows-Plattformen beschränkt war.</w:t>
+        <w:t>Ich nutze das „Worker Service“-Template für den Hintergrunddienst. Das Template implementiert die „Microsoft.Extensions.Hosting“-API. Damit ist die Anwendung potenziell auch in Linux-Umgebungen lauffähig. Dies ist eine deutliche Verbesserung gegenüber der veralteten Windows Services API der .NET-3.0 – Ära, welche lediglich auf Windows-Plattformen beschränkt war.</w:t>
       </w:r>
     </w:p>
     <w:p>
@@ -1813,23 +1781,7 @@
           <w:szCs w:val="20"/>
         </w:rPr>
         <w:lastRenderedPageBreak/>
-        <w:t xml:space="preserve">Für die Steuerung der Dienste werde ich die Klasse </w:t>
-      </w:r>
-      <w:proofErr w:type="gramStart"/>
-      <w:r>
-        <w:rPr>
-          <w:sz w:val="20"/>
-          <w:szCs w:val="20"/>
-        </w:rPr>
-        <w:t>System.ServiceProcess.ServiceController</w:t>
-      </w:r>
-      <w:proofErr w:type="gramEnd"/>
-      <w:r>
-        <w:rPr>
-          <w:sz w:val="20"/>
-          <w:szCs w:val="20"/>
-        </w:rPr>
-        <w:t xml:space="preserve"> importieren. Sie erlaubt den Zugriff auf Windows-Dienste ohne komplexe Aufrufe der Win32-API.</w:t>
+        <w:t>Für die Steuerung der Dienste werde ich die Klasse System.ServiceProcess.ServiceController importieren. Sie erlaubt den Zugriff auf Windows-Dienste ohne komplexe Aufrufe der Win32-API.</w:t>
       </w:r>
     </w:p>
     <w:p>
@@ -2181,23 +2133,7 @@
           <w:sz w:val="20"/>
           <w:szCs w:val="20"/>
         </w:rPr>
-        <w:t xml:space="preserve">Die Anwendung richtet sich an technisch versiertes Personal. Dabei müssen zwei unterschiedliche Anwendergruppen berücksichtigt </w:t>
-      </w:r>
-      <w:proofErr w:type="gramStart"/>
-      <w:r>
-        <w:rPr>
-          <w:sz w:val="20"/>
-          <w:szCs w:val="20"/>
-        </w:rPr>
-        <w:t>werden.Für</w:t>
-      </w:r>
-      <w:proofErr w:type="gramEnd"/>
-      <w:r>
-        <w:rPr>
-          <w:sz w:val="20"/>
-          <w:szCs w:val="20"/>
-        </w:rPr>
-        <w:t xml:space="preserve"> Entwickler muss die Software per Datei konfigurierbar sein. Systemadministratoren fordern hingegen eine Bedienung per grafischer Oberfläche. Daher wird die Anwendung in einem „Headless-Design“ realisiert. Das System besteht somit aus einem Hintergrunddienst ohne eigene grafische Oberfläche. Dieser bezieht seine Konfiguration aus einer Datei, welche entweder direkt bearbeitet oder über eine separate grafische Oberfläche erstellt und bearbeitet werden kann.</w:t>
+        <w:t>Die Anwendung richtet sich an technisch versiertes Personal. Dabei müssen zwei unterschiedliche Anwendergruppen berücksichtigt werden.Für Entwickler muss die Software per Datei konfigurierbar sein. Systemadministratoren fordern hingegen eine Bedienung per grafischer Oberfläche. Daher wird die Anwendung in einem „Headless-Design“ realisiert. Das System besteht somit aus einem Hintergrunddienst ohne eigene grafische Oberfläche. Dieser bezieht seine Konfiguration aus einer Datei, welche entweder direkt bearbeitet oder über eine separate grafische Oberfläche erstellt und bearbeitet werden kann.</w:t>
       </w:r>
     </w:p>
     <w:p>
@@ -2610,10 +2546,10 @@
           <w:noProof/>
         </w:rPr>
         <w:drawing>
-          <wp:inline distT="0" distB="0" distL="0" distR="0" wp14:anchorId="5741534A" wp14:editId="2906E91E">
-            <wp:extent cx="6159261" cy="3459452"/>
+          <wp:inline distT="0" distB="0" distL="0" distR="0" wp14:anchorId="1175E071" wp14:editId="4D1EA05F">
+            <wp:extent cx="5759450" cy="3239770"/>
             <wp:effectExtent l="0" t="0" r="0" b="0"/>
-            <wp:docPr id="1951662694" name="Grafik 2"/>
+            <wp:docPr id="2102840556" name="Grafik 1"/>
             <wp:cNvGraphicFramePr>
               <a:graphicFrameLocks xmlns:a="http://schemas.openxmlformats.org/drawingml/2006/main" noChangeAspect="1"/>
             </wp:cNvGraphicFramePr>
@@ -2621,36 +2557,23 @@
               <a:graphicData uri="http://schemas.openxmlformats.org/drawingml/2006/picture">
                 <pic:pic xmlns:pic="http://schemas.openxmlformats.org/drawingml/2006/picture">
                   <pic:nvPicPr>
-                    <pic:cNvPr id="0" name="Picture 6"/>
-                    <pic:cNvPicPr>
-                      <a:picLocks noChangeAspect="1" noChangeArrowheads="1"/>
-                    </pic:cNvPicPr>
+                    <pic:cNvPr id="2102840556" name=""/>
+                    <pic:cNvPicPr/>
                   </pic:nvPicPr>
                   <pic:blipFill>
-                    <a:blip r:embed="rId8" cstate="print">
-                      <a:extLst>
-                        <a:ext uri="{28A0092B-C50C-407E-A947-70E740481C1C}">
-                          <a14:useLocalDpi xmlns:a14="http://schemas.microsoft.com/office/drawing/2010/main" val="0"/>
-                        </a:ext>
-                      </a:extLst>
-                    </a:blip>
-                    <a:srcRect/>
+                    <a:blip r:embed="rId8"/>
                     <a:stretch>
                       <a:fillRect/>
                     </a:stretch>
                   </pic:blipFill>
-                  <pic:spPr bwMode="auto">
+                  <pic:spPr>
                     <a:xfrm>
                       <a:off x="0" y="0"/>
-                      <a:ext cx="6185721" cy="3474314"/>
+                      <a:ext cx="5759450" cy="3239770"/>
                     </a:xfrm>
                     <a:prstGeom prst="rect">
                       <a:avLst/>
                     </a:prstGeom>
-                    <a:noFill/>
-                    <a:ln>
-                      <a:noFill/>
-                    </a:ln>
                   </pic:spPr>
                 </pic:pic>
               </a:graphicData>
@@ -2659,7 +2582,6 @@
         </w:drawing>
       </w:r>
     </w:p>
-    <w:p/>
     <w:p>
       <w:pPr>
         <w:pStyle w:val="berschrift3"/>
@@ -2702,22 +2624,22 @@
           <w:sz w:val="20"/>
           <w:szCs w:val="20"/>
         </w:rPr>
+        <w:t>2.6.1 Benutzeranforderungen</w:t>
+      </w:r>
+    </w:p>
+    <w:p>
+      <w:pPr>
+        <w:rPr>
+          <w:sz w:val="20"/>
+          <w:szCs w:val="20"/>
+        </w:rPr>
+      </w:pPr>
+      <w:r>
+        <w:rPr>
+          <w:sz w:val="20"/>
+          <w:szCs w:val="20"/>
+        </w:rPr>
         <w:lastRenderedPageBreak/>
-        <w:t>2.6.1 Benutzeranforderungen</w:t>
-      </w:r>
-    </w:p>
-    <w:p>
-      <w:pPr>
-        <w:rPr>
-          <w:sz w:val="20"/>
-          <w:szCs w:val="20"/>
-        </w:rPr>
-      </w:pPr>
-      <w:r>
-        <w:rPr>
-          <w:sz w:val="20"/>
-          <w:szCs w:val="20"/>
-        </w:rPr>
         <w:t>Die oberste Ebene definieren die Benutzeranforderungen, welche in der Fachliteratur oft als Stakeholder-Anforderungen bezeichnet werden. Mein Fokus liegt hierbei auf der Identifikation der verschiedenen Interessengruppen sowie der Analyse ihrer spezifischen Erwartungen an die Lösung. Ein wesentlicher Bestandteil dieses Prozesses ist das Aufdecken und Auflösen potenzieller logischer Widersprüche zwischen den Anforderungen. Ich identifiziere die strategischen Kernziele sowie die gewünschten Fähigkeiten und Qualitäten der Software, ohne bereits technisch messbare Metriken festzulegen. Es geht primär um die Fähigkeiten, die das System zur Zielerreichung besitzen muss. Diese Anforderungen bilden die Grundlage für den späteren Abnahmetest, welcher validiert, ob die fertige Software die strategischen Ziele des Nutzers tatsächlich erfüllt.</w:t>
       </w:r>
     </w:p>
@@ -3009,23 +2931,7 @@
           <w:sz w:val="20"/>
           <w:szCs w:val="20"/>
         </w:rPr>
-        <w:t xml:space="preserve">Während der gesamten Stakeholder-Analyse achte ich auf eine strikte Trennung zwischen den Benutzerbedürfnissen und den nachfolgenden Systemanforderungen. In Analysegesprächen fordern Anwender häufig bereits konkrete technische </w:t>
-      </w:r>
-      <w:proofErr w:type="gramStart"/>
-      <w:r>
-        <w:rPr>
-          <w:sz w:val="20"/>
-          <w:szCs w:val="20"/>
-        </w:rPr>
-        <w:t>Lösungen</w:t>
-      </w:r>
-      <w:proofErr w:type="gramEnd"/>
-      <w:r>
-        <w:rPr>
-          <w:sz w:val="20"/>
-          <w:szCs w:val="20"/>
-        </w:rPr>
-        <w:t xml:space="preserve"> anstatt reine Anwendungsfälle zu beschreiben. Ein typisches Beispiel hierfür ist der Wunsch nach einer Schaltfläche für eine Summenfunktion. Das eigentliche fachliche Ziel ist jedoch die Einsicht in die Gesamtkosten einer Tabelle. Diese Vermischung resultiert oft aus einem sogenannten Solution Bias. Hierbei fixieren sich Beteiligte vorzeitig auf eine spezifische Lösungsidee. Dieses Problem verstärkt sich in meinem Projekt zusätzlich durch die hohe IT-Expertise der befragten Nutzer. Ich lege daher besonderen Wert auf diese Differenzierung. Eine saubere Trennung verhindert eine frühzeitige Einschränkung des Lösungsraums während der Entwicklung. Ich halte mir dadurch alle technischen Umsetzungsmöglichkeiten offen. Erst im nachfolgenden Schritt der Systemanforderungen benenne ich die konkreten technischen Lösungen zur Umsetzung der Stakeholder-Bedürfnisse.</w:t>
+        <w:t>Während der gesamten Stakeholder-Analyse achte ich auf eine strikte Trennung zwischen den Benutzerbedürfnissen und den nachfolgenden Systemanforderungen. In Analysegesprächen fordern Anwender häufig bereits konkrete technische Lösungen anstatt reine Anwendungsfälle zu beschreiben. Ein typisches Beispiel hierfür ist der Wunsch nach einer Schaltfläche für eine Summenfunktion. Das eigentliche fachliche Ziel ist jedoch die Einsicht in die Gesamtkosten einer Tabelle. Diese Vermischung resultiert oft aus einem sogenannten Solution Bias. Hierbei fixieren sich Beteiligte vorzeitig auf eine spezifische Lösungsidee. Dieses Problem verstärkt sich in meinem Projekt zusätzlich durch die hohe IT-Expertise der befragten Nutzer. Ich lege daher besonderen Wert auf diese Differenzierung. Eine saubere Trennung verhindert eine frühzeitige Einschränkung des Lösungsraums während der Entwicklung. Ich halte mir dadurch alle technischen Umsetzungsmöglichkeiten offen. Erst im nachfolgenden Schritt der Systemanforderungen benenne ich die konkreten technischen Lösungen zur Umsetzung der Stakeholder-Bedürfnisse.</w:t>
       </w:r>
     </w:p>
     <w:p>
@@ -3089,23 +2995,7 @@
           <w:szCs w:val="20"/>
         </w:rPr>
         <w:br/>
-        <w:t>Die funktionalen Anforderungen legen die konkreten Funktionalitäten der Software fest. Ich beantworte an dieser Stelle die Frage "WAS tut das System?</w:t>
-      </w:r>
-      <w:proofErr w:type="gramStart"/>
-      <w:r>
-        <w:rPr>
-          <w:sz w:val="20"/>
-          <w:szCs w:val="20"/>
-        </w:rPr>
-        <w:t>" .</w:t>
-      </w:r>
-      <w:proofErr w:type="gramEnd"/>
-      <w:r>
-        <w:rPr>
-          <w:sz w:val="20"/>
-          <w:szCs w:val="20"/>
-        </w:rPr>
-        <w:t xml:space="preserve"> Sämtliche Anforderungen müssen spezifisch, realistisch und vor allem messbar formuliert sein. Dies ermöglicht eine objektive Überprüfung der Zielerreichung im späteren Projektverlauf.</w:t>
+        <w:t>Die funktionalen Anforderungen legen die konkreten Funktionalitäten der Software fest. Ich beantworte an dieser Stelle die Frage "WAS tut das System?" . Sämtliche Anforderungen müssen spezifisch, realistisch und vor allem messbar formuliert sein. Dies ermöglicht eine objektive Überprüfung der Zielerreichung im späteren Projektverlauf.</w:t>
       </w:r>
     </w:p>
     <w:p>
@@ -3174,21 +3064,12 @@
         </w:rPr>
         <w:br/>
       </w:r>
-      <w:proofErr w:type="gramStart"/>
-      <w:r>
-        <w:rPr>
-          <w:sz w:val="20"/>
-          <w:szCs w:val="20"/>
-        </w:rPr>
-        <w:t>Neben</w:t>
-      </w:r>
-      <w:proofErr w:type="gramEnd"/>
-      <w:r>
-        <w:rPr>
-          <w:sz w:val="20"/>
-          <w:szCs w:val="20"/>
-        </w:rPr>
-        <w:t xml:space="preserve"> den Kernfunktionen und dem technologischen Rahmen wird die Software maßgeblich durch ihre Qualität definiert. Die nicht-funktionalen Anforderungen beantworten die Frage "Auf welche Art und Weise erreicht das System seine Ziele?". Ich beschreibe hierbei die qualitativen Aspekte der Dienstleistungserbringung. Diese Anforderungen betreffen insbesondere die Performance, die Sicherheit sowie die Wartbarkeit der Software.</w:t>
+      <w:r>
+        <w:rPr>
+          <w:sz w:val="20"/>
+          <w:szCs w:val="20"/>
+        </w:rPr>
+        <w:t>Neben den Kernfunktionen und dem technologischen Rahmen wird die Software maßgeblich durch ihre Qualität definiert. Die nicht-funktionalen Anforderungen beantworten die Frage "Auf welche Art und Weise erreicht das System seine Ziele?". Ich beschreibe hierbei die qualitativen Aspekte der Dienstleistungserbringung. Diese Anforderungen betreffen insbesondere die Performance, die Sicherheit sowie die Wartbarkeit der Software.</w:t>
       </w:r>
     </w:p>
     <w:p>
@@ -3292,21 +3173,12 @@
           <w:szCs w:val="20"/>
         </w:rPr>
       </w:pPr>
-      <w:proofErr w:type="gramStart"/>
-      <w:r>
-        <w:rPr>
-          <w:sz w:val="20"/>
-          <w:szCs w:val="20"/>
-        </w:rPr>
-        <w:t>Diesen Art</w:t>
-      </w:r>
-      <w:proofErr w:type="gramEnd"/>
-      <w:r>
-        <w:rPr>
-          <w:sz w:val="20"/>
-          <w:szCs w:val="20"/>
-        </w:rPr>
-        <w:t xml:space="preserve"> der Rückverfolgbarkeit wird meist als vertikale Traceability bezeichnet, da hierbei die Elemente der übergeordneten Ebene der Stakeholder-Anforderungen den Elementen der untergeordneten Systemanforderungen zugeordnet werden. Durch diese Methodik stelle ich sicher, dass jede technische Umsetzung einen validen fachlichen Ursprung besitzt und verhindere die Implementierung nicht autorisierter Funktionalitäten.</w:t>
+      <w:r>
+        <w:rPr>
+          <w:sz w:val="20"/>
+          <w:szCs w:val="20"/>
+        </w:rPr>
+        <w:t>Diesen Art der Rückverfolgbarkeit wird meist als vertikale Traceability bezeichnet, da hierbei die Elemente der übergeordneten Ebene der Stakeholder-Anforderungen den Elementen der untergeordneten Systemanforderungen zugeordnet werden. Durch diese Methodik stelle ich sicher, dass jede technische Umsetzung einen validen fachlichen Ursprung besitzt und verhindere die Implementierung nicht autorisierter Funktionalitäten.</w:t>
       </w:r>
     </w:p>
     <w:p>
@@ -3425,6 +3297,7 @@
       </w:pPr>
       <w:r>
         <w:rPr>
+          <w:noProof/>
           <w:sz w:val="20"/>
           <w:szCs w:val="20"/>
         </w:rPr>
@@ -3506,23 +3379,7 @@
           <w:sz w:val="20"/>
           <w:szCs w:val="20"/>
         </w:rPr>
-        <w:t xml:space="preserve">Bei der Darstellung handelt es sich um eine vereinfachte Repräsentation. </w:t>
-      </w:r>
-      <w:proofErr w:type="gramStart"/>
-      <w:r>
-        <w:rPr>
-          <w:sz w:val="20"/>
-          <w:szCs w:val="20"/>
-        </w:rPr>
-        <w:t>Das detailliertes Diagramm</w:t>
-      </w:r>
-      <w:proofErr w:type="gramEnd"/>
-      <w:r>
-        <w:rPr>
-          <w:sz w:val="20"/>
-          <w:szCs w:val="20"/>
-        </w:rPr>
-        <w:t>, welches im Rahmen der Gespräche, entstand befindet sich im Anhang dieser Dokumentation. Weitere Nutzergespräche ergaben zusätzliche Verbesserungswünsche. Ich plane daher die Implementierung eines detaillierten Logging-Systems ein. Die Legacy-Anwendung besitzt kein Logging, was derzeit zu einem hohen Maß an Frustration bei der Wartung führt. Basierend auf den ermittelten Benutzerwünschen, Motivationen und Anforderungen erstellte ich die Stakeholder-Analyse im Anhang.</w:t>
+        <w:t>Bei der Darstellung handelt es sich um eine vereinfachte Repräsentation. Das detailliertes Diagramm, welches im Rahmen der Gespräche, entstand befindet sich im Anhang dieser Dokumentation. Weitere Nutzergespräche ergaben zusätzliche Verbesserungswünsche. Ich plane daher die Implementierung eines detaillierten Logging-Systems ein. Die Legacy-Anwendung besitzt kein Logging, was derzeit zu einem hohen Maß an Frustration bei der Wartung führt. Basierend auf den ermittelten Benutzerwünschen, Motivationen und Anforderungen erstellte ich die Stakeholder-Analyse im Anhang.</w:t>
       </w:r>
     </w:p>
     <w:p>
@@ -3575,23 +3432,7 @@
           <w:sz w:val="20"/>
           <w:szCs w:val="20"/>
         </w:rPr>
-        <w:t xml:space="preserve">Weiterhin konkretisierte ich den Kundenwunsch nach einer zukunftsfähigen Lösung als Qualitätsmerkmal der Wartbarkeit und Modularität. Diese Anforderungen definierte ich gemäß dem Qualitätsmerkmalen der ISO 25010. Basierend darauf definierte ich, die Code-Qualität durch Prinzipien des Clean Code, wie das Liskov-Substitutionsprinzip oder der Separation of </w:t>
-      </w:r>
-      <w:proofErr w:type="gramStart"/>
-      <w:r>
-        <w:rPr>
-          <w:sz w:val="20"/>
-          <w:szCs w:val="20"/>
-        </w:rPr>
-        <w:t>Concerns ,</w:t>
-      </w:r>
-      <w:proofErr w:type="gramEnd"/>
-      <w:r>
-        <w:rPr>
-          <w:sz w:val="20"/>
-          <w:szCs w:val="20"/>
-        </w:rPr>
-        <w:t xml:space="preserve"> sicherzustellen. Diese Qualitäten garantieren, dass die Software für zukünftige Entwickler leicht lesbar bleibt und Anpassungen keine unvorhersehbaren Seiteneffekte in anderen Programmteilen verursachen.</w:t>
+        <w:t>Weiterhin konkretisierte ich den Kundenwunsch nach einer zukunftsfähigen Lösung als Qualitätsmerkmal der Wartbarkeit und Modularität. Diese Anforderungen definierte ich gemäß dem Qualitätsmerkmalen der ISO 25010. Basierend darauf definierte ich, die Code-Qualität durch Prinzipien des Clean Code, wie das Liskov-Substitutionsprinzip oder der Separation of Concerns , sicherzustellen. Diese Qualitäten garantieren, dass die Software für zukünftige Entwickler leicht lesbar bleibt und Anpassungen keine unvorhersehbaren Seiteneffekte in anderen Programmteilen verursachen.</w:t>
       </w:r>
     </w:p>
     <w:p>
@@ -3607,39 +3448,7 @@
           <w:szCs w:val="20"/>
         </w:rPr>
         <w:lastRenderedPageBreak/>
-        <w:t xml:space="preserve">Abschließend priorisierte ich die Anforderungen gemäß der MoSCoW-Methode unter Berücksichtigung der Kundenaussagen. Alle Funktionen der Legacy-Anwendung klassifizierte ich als verbindliche Must-have-Anforderungen. Die Verwendung der Programmiersprache C# ordnete ich als Should-have ein. Die Entwickler des Kunden empfahlen diese Sprache aufgrund ihrer Expertise </w:t>
-      </w:r>
-      <w:proofErr w:type="gramStart"/>
-      <w:r>
-        <w:rPr>
-          <w:sz w:val="20"/>
-          <w:szCs w:val="20"/>
-        </w:rPr>
-        <w:t>darin</w:t>
-      </w:r>
-      <w:proofErr w:type="gramEnd"/>
-      <w:r>
-        <w:rPr>
-          <w:sz w:val="20"/>
-          <w:szCs w:val="20"/>
-        </w:rPr>
-        <w:t xml:space="preserve"> was </w:t>
-      </w:r>
-      <w:proofErr w:type="gramStart"/>
-      <w:r>
-        <w:rPr>
-          <w:sz w:val="20"/>
-          <w:szCs w:val="20"/>
-        </w:rPr>
-        <w:t>die späteren Wartung</w:t>
-      </w:r>
-      <w:proofErr w:type="gramEnd"/>
-      <w:r>
-        <w:rPr>
-          <w:sz w:val="20"/>
-          <w:szCs w:val="20"/>
-        </w:rPr>
-        <w:t xml:space="preserve"> erleichtern würde. Dennoch blieb die Wahl anderer Technologien bei entsprechender Begründung freigestellt. Auch die Konfiguration über die grafische Benutzeroberfläche definierte ich als Should-have, da die funktionale Zuverlässigkeit des Hintergrunddienstes Vorrang besitzt. Die Prüfung technischer Abhängigkeiten, welche ich konkret als Portprüfung spezifizierte, stufte ich als Could-have ein. Da die Legacy-Anwendung diese Funktion nicht besaß, bewertete der Kunde sie als optional. Ebenso ordnete ich eine mögliche E-Mail-Benachrichtigung den Could-have-Kriterien zu. Den Ausblick auf eine Cloud-Anbindung oder eine Integration über einen Server-Eye-Connector definierte ich als Won’t-have. Diese Erweiterungen sind nicht Bestandteil der aktuellen Projektiteration, wurden jedoch bei der Architekturplanung für eine zukünftige Implementierung berücksichtigt.</w:t>
+        <w:t>Abschließend priorisierte ich die Anforderungen gemäß der MoSCoW-Methode unter Berücksichtigung der Kundenaussagen. Alle Funktionen der Legacy-Anwendung klassifizierte ich als verbindliche Must-have-Anforderungen. Die Verwendung der Programmiersprache C# ordnete ich als Should-have ein. Die Entwickler des Kunden empfahlen diese Sprache aufgrund ihrer Expertise darin was die späteren Wartung erleichtern würde. Dennoch blieb die Wahl anderer Technologien bei entsprechender Begründung freigestellt. Auch die Konfiguration über die grafische Benutzeroberfläche definierte ich als Should-have, da die funktionale Zuverlässigkeit des Hintergrunddienstes Vorrang besitzt. Die Prüfung technischer Abhängigkeiten, welche ich konkret als Portprüfung spezifizierte, stufte ich als Could-have ein. Da die Legacy-Anwendung diese Funktion nicht besaß, bewertete der Kunde sie als optional. Ebenso ordnete ich eine mögliche E-Mail-Benachrichtigung den Could-have-Kriterien zu. Den Ausblick auf eine Cloud-Anbindung oder eine Integration über einen Server-Eye-Connector definierte ich als Won’t-have. Diese Erweiterungen sind nicht Bestandteil der aktuellen Projektiteration, wurden jedoch bei der Architekturplanung für eine zukünftige Implementierung berücksichtigt.</w:t>
       </w:r>
     </w:p>
     <w:p/>
@@ -3675,6 +3484,7 @@
       </w:pPr>
       <w:r>
         <w:rPr>
+          <w:noProof/>
           <w:sz w:val="20"/>
           <w:szCs w:val="20"/>
         </w:rPr>
@@ -3741,23 +3551,7 @@
           <w:sz w:val="20"/>
           <w:szCs w:val="20"/>
         </w:rPr>
-        <w:t xml:space="preserve">Ein Kernaspekt der dritten Phase ist die Definition eines Vertrages zwischen den Komponenten in Form einer Spezifikation der Datenschnittstelle. Meine Aufgabe bestand darin, ein geeignetes Datenmodell zu entwerfen, den Dateityp zu wählen und die erforderlichen Informationen inklusive ihrer Datentypen festzulegen. Bei der Auswahl des Formats analysierte ich zunächst verschiedene moderne Standards. Ursprünglich fiel meine Wahl auf YAML, da dieses Format für die menschliche Lesbarkeit optimiert ist und eine minimale Syntax ohne komplexe Klammersetzung benötigt. In der Abstimmung mit meinem Ausbilder wurde dieser Vorschlag jedoch abgelehnt. Wir entschieden uns stattdessen für JSON, da dieses Format im Unternehmen bereits standardmäßig eingesetzt wird und alle Entwickler damit vertraut sind. Für die Schnittstellenbeschreibung definierte ich alle relevanten Informationen, die das System abbilden muss. Dazu gehören die </w:t>
-      </w:r>
-      <w:proofErr w:type="gramStart"/>
-      <w:r>
-        <w:rPr>
-          <w:sz w:val="20"/>
-          <w:szCs w:val="20"/>
-        </w:rPr>
-        <w:t>zu überwachenden Dienste</w:t>
-      </w:r>
-      <w:proofErr w:type="gramEnd"/>
-      <w:r>
-        <w:rPr>
-          <w:sz w:val="20"/>
-          <w:szCs w:val="20"/>
-        </w:rPr>
-        <w:t xml:space="preserve"> inklusive ihrer Startverzögerungen, Log-Tests und Port-Prüfungen sowie deren Ausführungsreihenfolge. Zusätzlich integrierte ich Konfigurationen für den Mail-Server und globale Einstellungen wie das Log-Level. Ich wählte für diese Informationen passende Datentypen und bildete sie in JSON als strukturierte Objekte ab. Das resultierende Datenmodell dokumentierte ich in Form einer Beispiel-JSON-Datei sowie in einem detaillierten Klassendiagramm im Anhang.</w:t>
+        <w:t>Ein Kernaspekt der dritten Phase ist die Definition eines Vertrages zwischen den Komponenten in Form einer Spezifikation der Datenschnittstelle. Meine Aufgabe bestand darin, ein geeignetes Datenmodell zu entwerfen, den Dateityp zu wählen und die erforderlichen Informationen inklusive ihrer Datentypen festzulegen. Bei der Auswahl des Formats analysierte ich zunächst verschiedene moderne Standards. Ursprünglich fiel meine Wahl auf YAML, da dieses Format für die menschliche Lesbarkeit optimiert ist und eine minimale Syntax ohne komplexe Klammersetzung benötigt. In der Abstimmung mit meinem Ausbilder wurde dieser Vorschlag jedoch abgelehnt. Wir entschieden uns stattdessen für JSON, da dieses Format im Unternehmen bereits standardmäßig eingesetzt wird und alle Entwickler damit vertraut sind. Für die Schnittstellenbeschreibung definierte ich alle relevanten Informationen, die das System abbilden muss. Dazu gehören die zu überwachenden Dienste inklusive ihrer Startverzögerungen, Log-Tests und Port-Prüfungen sowie deren Ausführungsreihenfolge. Zusätzlich integrierte ich Konfigurationen für den Mail-Server und globale Einstellungen wie das Log-Level. Ich wählte für diese Informationen passende Datentypen und bildete sie in JSON als strukturierte Objekte ab. Das resultierende Datenmodell dokumentierte ich in Form einer Beispiel-JSON-Datei sowie in einem detaillierten Klassendiagramm im Anhang.</w:t>
       </w:r>
     </w:p>
     <w:p/>
@@ -3808,6 +3602,7 @@
         <w:docPartUnique/>
       </w:docPartObj>
     </w:sdtPr>
+    <w:sdtEndPr/>
     <w:sdtContent>
       <w:p>
         <w:pPr>
@@ -3883,6 +3678,7 @@
                                 </w:rPr>
                                 <w:id w:val="1709992740"/>
                               </w:sdtPr>
+                              <w:sdtEndPr/>
                               <w:sdtContent>
                                 <w:sdt>
                                   <w:sdtPr>
@@ -3893,6 +3689,7 @@
                                     </w:rPr>
                                     <w:id w:val="-1904517296"/>
                                   </w:sdtPr>
+                                  <w:sdtEndPr/>
                                   <w:sdtContent>
                                     <w:p>
                                       <w:pPr>
@@ -3974,6 +3771,7 @@
                           </w:rPr>
                           <w:id w:val="1709992740"/>
                         </w:sdtPr>
+                        <w:sdtEndPr/>
                         <w:sdtContent>
                           <w:sdt>
                             <w:sdtPr>
@@ -3984,6 +3782,7 @@
                               </w:rPr>
                               <w:id w:val="-1904517296"/>
                             </w:sdtPr>
+                            <w:sdtEndPr/>
                             <w:sdtContent>
                               <w:p>
                                 <w:pPr>
@@ -4674,6 +4473,7 @@
   <w:style w:type="character" w:default="1" w:styleId="Absatz-Standardschriftart">
     <w:name w:val="Default Paragraph Font"/>
     <w:uiPriority w:val="1"/>
+    <w:semiHidden/>
     <w:unhideWhenUsed/>
   </w:style>
   <w:style w:type="table" w:default="1" w:styleId="NormaleTabelle">

</xml_diff>